<commit_message>
Added more documents & updated README
</commit_message>
<xml_diff>
--- a/Cabot Capstone Final Report.docx
+++ b/Cabot Capstone Final Report.docx
@@ -725,7 +725,7 @@
         <w:rPr>
           <w:rFonts w:ascii="Times New Roman" w:hAnsi="Times New Roman" w:cs="Times New Roman"/>
         </w:rPr>
-        <w:t>???</w:t>
+        <w:t>5</w:t>
       </w:r>
     </w:p>
     <w:p>
@@ -780,6 +780,14 @@
           <w:bCs/>
         </w:rPr>
         <w:t>Methodology</w:t>
+      </w:r>
+      <w:r>
+        <w:rPr>
+          <w:rFonts w:ascii="Times New Roman" w:hAnsi="Times New Roman" w:cs="Times New Roman"/>
+          <w:b/>
+          <w:bCs/>
+        </w:rPr>
+        <w:t xml:space="preserve"> &amp; Implementation</w:t>
       </w:r>
       <w:r>
         <w:rPr>
@@ -1324,13 +1332,7 @@
         <w:rPr>
           <w:rFonts w:ascii="Times New Roman" w:hAnsi="Times New Roman" w:cs="Times New Roman"/>
         </w:rPr>
-        <w:t xml:space="preserve"> </w:t>
-      </w:r>
-      <w:r>
-        <w:rPr>
-          <w:rFonts w:ascii="Times New Roman" w:hAnsi="Times New Roman" w:cs="Times New Roman"/>
-        </w:rPr>
-        <w:t>My target for this project is my fellow students with neurodivergences or learning disabilities, as they are especially prone to distraction. I plan to do this by creating a controlled distraction game, one that sits on top of other windows and encourages regular engagement every few minutes, keeping a person at their computer and engaged without demanding so much attention that the users are completely disengaged from their task. I’ll be using the Unity 2D Engine to develop the game. Similar ideas have been attempted before, as I will go over shortly, but I think they don’t hit the sweet spot of being engaging without being too distracting.</w:t>
+        <w:t xml:space="preserve"> My target for this project is my fellow students with neurodivergences or learning disabilities, as they are especially prone to distraction. I plan to do this by creating a controlled distraction game, one that sits on top of other windows and encourages regular engagement every few minutes, keeping a person at their computer and engaged without demanding so much attention that the users are completely disengaged from their task. I’ll be using the Unity 2D Engine to develop the game. Similar ideas have been attempted before, as I will go over shortly, but I think they don’t hit the sweet spot of being engaging without being too distracting.</w:t>
       </w:r>
     </w:p>
     <w:p>
@@ -1631,13 +1633,55 @@
           <w:rFonts w:ascii="Times New Roman" w:hAnsi="Times New Roman" w:cs="Times New Roman"/>
         </w:rPr>
         <w:tab/>
-        <w:t xml:space="preserve">In the domain of game design the term “dominant strategy” is used to refer to a habit by players to find and exploit the most efficient tactics possible. It is then the job of a developer to make the dominant strategy </w:t>
-      </w:r>
-      <w:r>
-        <w:rPr>
-          <w:rFonts w:ascii="Times New Roman" w:hAnsi="Times New Roman" w:cs="Times New Roman"/>
-        </w:rPr>
-        <w:t>as hard to identify as possible, or in the case of these games, as healthy as possible for the user. When the dominant strategy for a game that is supposed to aid in my productivity is to be away from the device that has all of my work, the game has failed its users in its primary purpose.</w:t>
+        <w:t xml:space="preserve">In the domain of game </w:t>
+      </w:r>
+      <w:r>
+        <w:rPr>
+          <w:rFonts w:ascii="Times New Roman" w:hAnsi="Times New Roman" w:cs="Times New Roman"/>
+        </w:rPr>
+        <w:t>design,</w:t>
+      </w:r>
+      <w:r>
+        <w:rPr>
+          <w:rFonts w:ascii="Times New Roman" w:hAnsi="Times New Roman" w:cs="Times New Roman"/>
+        </w:rPr>
+        <w:t xml:space="preserve"> the term “dominant strategy” is used to refer to a habit by players to find and exploit the most efficient tactics possible. It is then the job of a developer to make the dominant strategy </w:t>
+      </w:r>
+      <w:r>
+        <w:rPr>
+          <w:rFonts w:ascii="Times New Roman" w:hAnsi="Times New Roman" w:cs="Times New Roman"/>
+        </w:rPr>
+        <w:t xml:space="preserve">as hard to identify as possible, or in the case of these games, as healthy as possible for the user. When the dominant strategy for a game that is supposed to aid in my productivity is to be away from the device that has </w:t>
+      </w:r>
+      <w:r>
+        <w:rPr>
+          <w:rFonts w:ascii="Times New Roman" w:hAnsi="Times New Roman" w:cs="Times New Roman"/>
+        </w:rPr>
+        <w:t>all</w:t>
+      </w:r>
+      <w:r>
+        <w:rPr>
+          <w:rFonts w:ascii="Times New Roman" w:hAnsi="Times New Roman" w:cs="Times New Roman"/>
+        </w:rPr>
+        <w:t xml:space="preserve"> my work, the game has failed its users in its primary purpose.</w:t>
+      </w:r>
+      <w:r>
+        <w:rPr>
+          <w:rFonts w:ascii="Times New Roman" w:hAnsi="Times New Roman" w:cs="Times New Roman"/>
+        </w:rPr>
+        <w:t xml:space="preserve"> Most games try to make a dominant strategy hard, if not impossible to identify, but since I am developing a game that is </w:t>
+      </w:r>
+      <w:r>
+        <w:rPr>
+          <w:rFonts w:ascii="Times New Roman" w:hAnsi="Times New Roman" w:cs="Times New Roman"/>
+        </w:rPr>
+        <w:t>designed to help users with focus, I instead want the dominant strategy to be easily identifiable, and for that dominant strategy to encourage</w:t>
+      </w:r>
+      <w:r>
+        <w:rPr>
+          <w:rFonts w:ascii="Times New Roman" w:hAnsi="Times New Roman" w:cs="Times New Roman"/>
+        </w:rPr>
+        <w:t xml:space="preserve"> healthy work habits.</w:t>
       </w:r>
     </w:p>
     <w:p>
@@ -1663,7 +1707,14 @@
         <w:rPr>
           <w:rFonts w:ascii="Times New Roman" w:hAnsi="Times New Roman" w:cs="Times New Roman"/>
         </w:rPr>
-        <w:t xml:space="preserve"> some research on learning disabilities and attention deficits, I found some research about using music as a controlled distraction for students with learning struggles. One piece of note I found was that supposedly giving students a choice on their controlled distraction improved its effectiveness, so adding alternative distractions to the existing pool is useful (Homann, Drody, &amp; Smilek, 2023). Some pointed out that music with lyrics would often demand too much attention for some students, an experience I’ve had myself (Velasco &amp; Moreno, 2025</w:t>
+        <w:t xml:space="preserve"> some research on learning disabilities and attention deficits, I found some research about using music as a controlled distraction for students with learning struggles. One piece of note I found was that supposedly giving students a choice on their controlled distraction improved its effectiveness, so adding alternative distractions to the existing pool is useful (Homann, Drody, &amp; Smilek, 2023). Some </w:t>
+      </w:r>
+      <w:r>
+        <w:rPr>
+          <w:rFonts w:ascii="Times New Roman" w:hAnsi="Times New Roman" w:cs="Times New Roman"/>
+        </w:rPr>
+        <w:lastRenderedPageBreak/>
+        <w:t>pointed out that music with lyrics would often demand too much attention for some students, an experience I’ve had myself (Velasco &amp; Moreno, 2025</w:t>
       </w:r>
       <w:r>
         <w:rPr>
@@ -1675,14 +1726,7 @@
         <w:rPr>
           <w:rFonts w:ascii="Times New Roman" w:hAnsi="Times New Roman" w:cs="Times New Roman"/>
         </w:rPr>
-        <w:t xml:space="preserve">There’s notably not a lot of work on using games as a controlled distraction, though there is research on game-ified learning and VR </w:t>
-      </w:r>
-      <w:r>
-        <w:rPr>
-          <w:rFonts w:ascii="Times New Roman" w:hAnsi="Times New Roman" w:cs="Times New Roman"/>
-        </w:rPr>
-        <w:lastRenderedPageBreak/>
-        <w:t>learning environments (Kurt &amp; Tomul, 2026). I hope</w:t>
+        <w:t>There’s notably not a lot of work on using games as a controlled distraction, though there is research on game-ified learning and VR learning environments (Kurt &amp; Tomul, 2026). I hope</w:t>
       </w:r>
       <w:r>
         <w:rPr>
@@ -1806,20 +1850,6 @@
         </w:rPr>
         <w:t>such roadblocks is universal. As such I believe it is important to move forward understanding that my approach can never truly cater to everyone, but I must nonetheless make it my mission to be mindful.</w:t>
       </w:r>
-    </w:p>
-    <w:p>
-      <w:pPr>
-        <w:rPr>
-          <w:rFonts w:ascii="Times New Roman" w:hAnsi="Times New Roman" w:cs="Times New Roman"/>
-        </w:rPr>
-      </w:pPr>
-    </w:p>
-    <w:p>
-      <w:pPr>
-        <w:rPr>
-          <w:rFonts w:ascii="Times New Roman" w:hAnsi="Times New Roman" w:cs="Times New Roman"/>
-        </w:rPr>
-      </w:pPr>
     </w:p>
     <w:p>
       <w:pPr>
@@ -1917,23 +1947,68 @@
         <w:rPr>
           <w:rFonts w:ascii="Times New Roman" w:hAnsi="Times New Roman" w:cs="Times New Roman"/>
         </w:rPr>
-        <w:t xml:space="preserve">Very large section, show off the diagrams and talk about the structure of the game. Talk about the game’s pixel art, what software was used, </w:t>
-      </w:r>
-      <w:r>
-        <w:rPr>
-          <w:rFonts w:ascii="Times New Roman" w:hAnsi="Times New Roman" w:cs="Times New Roman"/>
-        </w:rPr>
-        <w:t>more notes about the general approach. Everything pre-prototype can go here.</w:t>
-      </w:r>
-      <w:r>
-        <w:rPr>
-          <w:rFonts w:ascii="Times New Roman" w:hAnsi="Times New Roman" w:cs="Times New Roman"/>
-        </w:rPr>
-        <w:t xml:space="preserve"> Design will largely go over the planning and some of the visual design aspects.</w:t>
-      </w:r>
-    </w:p>
-    <w:p>
-      <w:pPr>
+        <w:t>When designing this project, I wanted to go into it with at least a rough</w:t>
+      </w:r>
+      <w:r>
+        <w:rPr>
+          <w:rFonts w:ascii="Times New Roman" w:hAnsi="Times New Roman" w:cs="Times New Roman"/>
+        </w:rPr>
+        <w:t xml:space="preserve"> idea of how my system would</w:t>
+      </w:r>
+      <w:r>
+        <w:rPr>
+          <w:rFonts w:ascii="Times New Roman" w:hAnsi="Times New Roman" w:cs="Times New Roman"/>
+        </w:rPr>
+        <w:t xml:space="preserve"> be structured. I wanted to have an outline to refer to ahead of time since I would need to design the game from the ground up as an interconnected system, and wanted to know what would need to be public and accessible, and what would need to stay private. This is important in any system, but especially so in games where bug fixing is a very significant portion of the implem</w:t>
+      </w:r>
+      <w:r>
+        <w:rPr>
+          <w:rFonts w:ascii="Times New Roman" w:hAnsi="Times New Roman" w:cs="Times New Roman"/>
+        </w:rPr>
+        <w:t>entation</w:t>
+      </w:r>
+      <w:r>
+        <w:rPr>
+          <w:rFonts w:ascii="Times New Roman" w:hAnsi="Times New Roman" w:cs="Times New Roman"/>
+        </w:rPr>
+        <w:t xml:space="preserve">, as the increased degree of user interactivity often prompts a game to </w:t>
+      </w:r>
+      <w:r>
+        <w:rPr>
+          <w:rFonts w:ascii="Times New Roman" w:hAnsi="Times New Roman" w:cs="Times New Roman"/>
+        </w:rPr>
+        <w:t>require more regular intercommunication</w:t>
+      </w:r>
+      <w:r>
+        <w:rPr>
+          <w:rFonts w:ascii="Times New Roman" w:hAnsi="Times New Roman" w:cs="Times New Roman"/>
+        </w:rPr>
+        <w:t>.</w:t>
+      </w:r>
+    </w:p>
+    <w:p>
+      <w:pPr>
+        <w:rPr>
+          <w:rFonts w:ascii="Times New Roman" w:hAnsi="Times New Roman" w:cs="Times New Roman"/>
+        </w:rPr>
+      </w:pPr>
+      <w:r>
+        <w:rPr>
+          <w:rFonts w:ascii="Times New Roman" w:hAnsi="Times New Roman" w:cs="Times New Roman"/>
+        </w:rPr>
+        <w:tab/>
+        <w:t xml:space="preserve">When I began designing the project, I came up with a design diagram pictured below of what I expected my architecture to look like, with the goal of making it much smaller. While I wanted to abide by OOP principles if I could, I also wanted the system to be small and easy to understand. An aspect of my approach I consider essential is designing it for further expansion. I knew from the start I wouldn’t be making a commercial indie game, doing so in my limited time frame and extensive courseload this semester was unrealistic. So I wanted to build my system </w:t>
+      </w:r>
+      <w:r>
+        <w:rPr>
+          <w:rFonts w:ascii="Times New Roman" w:hAnsi="Times New Roman" w:cs="Times New Roman"/>
+        </w:rPr>
+        <w:t>so I could say, present it to a team and easily be able to work with them. Despite working alone, making my code easy to read and interpret was a top priority, which also meant keeping the game’s logic simple.</w:t>
+      </w:r>
+    </w:p>
+    <w:p>
+      <w:pPr>
+        <w:jc w:val="center"/>
         <w:rPr>
           <w:rFonts w:ascii="Times New Roman" w:hAnsi="Times New Roman" w:cs="Times New Roman"/>
           <w:b/>
@@ -1945,9 +2020,376 @@
           <w:rFonts w:ascii="Times New Roman" w:hAnsi="Times New Roman" w:cs="Times New Roman"/>
           <w:b/>
           <w:bCs/>
-        </w:rPr>
-        <w:t>Subsection on redesigning after roadblocks and testing?</w:t>
-      </w:r>
+          <w:noProof/>
+        </w:rPr>
+        <w:drawing>
+          <wp:inline distT="0" distB="0" distL="0" distR="0" wp14:anchorId="46FAE92E" wp14:editId="2EA5454D">
+            <wp:extent cx="5144947" cy="3856392"/>
+            <wp:effectExtent l="0" t="0" r="0" b="0"/>
+            <wp:docPr id="1960583165" name="Picture 1"/>
+            <wp:cNvGraphicFramePr>
+              <a:graphicFrameLocks xmlns:a="http://schemas.openxmlformats.org/drawingml/2006/main" noChangeAspect="1"/>
+            </wp:cNvGraphicFramePr>
+            <a:graphic xmlns:a="http://schemas.openxmlformats.org/drawingml/2006/main">
+              <a:graphicData uri="http://schemas.openxmlformats.org/drawingml/2006/picture">
+                <pic:pic xmlns:pic="http://schemas.openxmlformats.org/drawingml/2006/picture">
+                  <pic:nvPicPr>
+                    <pic:cNvPr id="1960583165" name="Picture 1960583165"/>
+                    <pic:cNvPicPr/>
+                  </pic:nvPicPr>
+                  <pic:blipFill>
+                    <a:blip r:embed="rId7">
+                      <a:extLst>
+                        <a:ext uri="{28A0092B-C50C-407E-A947-70E740481C1C}">
+                          <a14:useLocalDpi xmlns:a14="http://schemas.microsoft.com/office/drawing/2010/main" val="0"/>
+                        </a:ext>
+                      </a:extLst>
+                    </a:blip>
+                    <a:stretch>
+                      <a:fillRect/>
+                    </a:stretch>
+                  </pic:blipFill>
+                  <pic:spPr>
+                    <a:xfrm>
+                      <a:off x="0" y="0"/>
+                      <a:ext cx="5147839" cy="3858560"/>
+                    </a:xfrm>
+                    <a:prstGeom prst="rect">
+                      <a:avLst/>
+                    </a:prstGeom>
+                  </pic:spPr>
+                </pic:pic>
+              </a:graphicData>
+            </a:graphic>
+          </wp:inline>
+        </w:drawing>
+      </w:r>
+    </w:p>
+    <w:p>
+      <w:pPr>
+        <w:rPr>
+          <w:rFonts w:ascii="Times New Roman" w:hAnsi="Times New Roman" w:cs="Times New Roman"/>
+        </w:rPr>
+      </w:pPr>
+      <w:r>
+        <w:rPr>
+          <w:rFonts w:ascii="Times New Roman" w:hAnsi="Times New Roman" w:cs="Times New Roman"/>
+          <w:b/>
+          <w:bCs/>
+        </w:rPr>
+        <w:tab/>
+      </w:r>
+      <w:r>
+        <w:rPr>
+          <w:rFonts w:ascii="Times New Roman" w:hAnsi="Times New Roman" w:cs="Times New Roman"/>
+        </w:rPr>
+        <w:t>As I worked,</w:t>
+      </w:r>
+      <w:r>
+        <w:rPr>
+          <w:rFonts w:ascii="Times New Roman" w:hAnsi="Times New Roman" w:cs="Times New Roman"/>
+        </w:rPr>
+        <w:t xml:space="preserve"> I trimmed the fat of this plan. Both the plant collection and cosmetics were scrapped</w:t>
+      </w:r>
+      <w:r>
+        <w:rPr>
+          <w:rFonts w:ascii="Times New Roman" w:hAnsi="Times New Roman" w:cs="Times New Roman"/>
+        </w:rPr>
+        <w:t xml:space="preserve"> due to time constraints. </w:t>
+      </w:r>
+      <w:r>
+        <w:rPr>
+          <w:rFonts w:ascii="Times New Roman" w:hAnsi="Times New Roman" w:cs="Times New Roman"/>
+        </w:rPr>
+        <w:t xml:space="preserve">Additionally, I had to scrap the idea o fmultiple tasks, both to </w:t>
+      </w:r>
+      <w:r>
+        <w:rPr>
+          <w:rFonts w:ascii="Times New Roman" w:hAnsi="Times New Roman" w:cs="Times New Roman"/>
+        </w:rPr>
+        <w:lastRenderedPageBreak/>
+        <w:t xml:space="preserve">save time and because I realized they added very little, especially relative to the work needed to implement them without issue into my system architecture. </w:t>
+      </w:r>
+      <w:r>
+        <w:rPr>
+          <w:rFonts w:ascii="Times New Roman" w:hAnsi="Times New Roman" w:cs="Times New Roman"/>
+        </w:rPr>
+        <w:t>I’ll talk about those more in depth in the Future Improvement section, and give some insight on what they could look like</w:t>
+      </w:r>
+      <w:r>
+        <w:rPr>
+          <w:rFonts w:ascii="Times New Roman" w:hAnsi="Times New Roman" w:cs="Times New Roman"/>
+        </w:rPr>
+        <w:t xml:space="preserve">. An </w:t>
+      </w:r>
+      <w:r>
+        <w:rPr>
+          <w:rFonts w:ascii="Times New Roman" w:hAnsi="Times New Roman" w:cs="Times New Roman"/>
+        </w:rPr>
+        <w:t>up-to-date</w:t>
+      </w:r>
+      <w:r>
+        <w:rPr>
+          <w:rFonts w:ascii="Times New Roman" w:hAnsi="Times New Roman" w:cs="Times New Roman"/>
+        </w:rPr>
+        <w:t xml:space="preserve"> version of this diagram is shown below, which more accurately reflects the final </w:t>
+      </w:r>
+      <w:r>
+        <w:rPr>
+          <w:rFonts w:ascii="Times New Roman" w:hAnsi="Times New Roman" w:cs="Times New Roman"/>
+        </w:rPr>
+        <w:t>demo of the game</w:t>
+      </w:r>
+      <w:r>
+        <w:rPr>
+          <w:rFonts w:ascii="Times New Roman" w:hAnsi="Times New Roman" w:cs="Times New Roman"/>
+        </w:rPr>
+        <w:t>.</w:t>
+      </w:r>
+    </w:p>
+    <w:p>
+      <w:pPr>
+        <w:jc w:val="center"/>
+        <w:rPr>
+          <w:rFonts w:ascii="Times New Roman" w:hAnsi="Times New Roman" w:cs="Times New Roman"/>
+        </w:rPr>
+      </w:pPr>
+      <w:r>
+        <w:rPr>
+          <w:rFonts w:ascii="Times New Roman" w:hAnsi="Times New Roman" w:cs="Times New Roman"/>
+          <w:noProof/>
+        </w:rPr>
+        <w:drawing>
+          <wp:inline distT="0" distB="0" distL="0" distR="0" wp14:anchorId="4153BC12" wp14:editId="5631B6B6">
+            <wp:extent cx="5943600" cy="4457700"/>
+            <wp:effectExtent l="0" t="0" r="0" b="0"/>
+            <wp:docPr id="1143157029" name="Picture 2"/>
+            <wp:cNvGraphicFramePr>
+              <a:graphicFrameLocks xmlns:a="http://schemas.openxmlformats.org/drawingml/2006/main" noChangeAspect="1"/>
+            </wp:cNvGraphicFramePr>
+            <a:graphic xmlns:a="http://schemas.openxmlformats.org/drawingml/2006/main">
+              <a:graphicData uri="http://schemas.openxmlformats.org/drawingml/2006/picture">
+                <pic:pic xmlns:pic="http://schemas.openxmlformats.org/drawingml/2006/picture">
+                  <pic:nvPicPr>
+                    <pic:cNvPr id="1143157029" name="Picture 1143157029"/>
+                    <pic:cNvPicPr/>
+                  </pic:nvPicPr>
+                  <pic:blipFill>
+                    <a:blip r:embed="rId8">
+                      <a:extLst>
+                        <a:ext uri="{28A0092B-C50C-407E-A947-70E740481C1C}">
+                          <a14:useLocalDpi xmlns:a14="http://schemas.microsoft.com/office/drawing/2010/main" val="0"/>
+                        </a:ext>
+                      </a:extLst>
+                    </a:blip>
+                    <a:stretch>
+                      <a:fillRect/>
+                    </a:stretch>
+                  </pic:blipFill>
+                  <pic:spPr>
+                    <a:xfrm>
+                      <a:off x="0" y="0"/>
+                      <a:ext cx="5943600" cy="4457700"/>
+                    </a:xfrm>
+                    <a:prstGeom prst="rect">
+                      <a:avLst/>
+                    </a:prstGeom>
+                  </pic:spPr>
+                </pic:pic>
+              </a:graphicData>
+            </a:graphic>
+          </wp:inline>
+        </w:drawing>
+      </w:r>
+    </w:p>
+    <w:p>
+      <w:pPr>
+        <w:rPr>
+          <w:rFonts w:ascii="Times New Roman" w:hAnsi="Times New Roman" w:cs="Times New Roman"/>
+        </w:rPr>
+      </w:pPr>
+      <w:r>
+        <w:rPr>
+          <w:rFonts w:ascii="Times New Roman" w:hAnsi="Times New Roman" w:cs="Times New Roman"/>
+        </w:rPr>
+        <w:tab/>
+        <w:t>The tasks were simplified</w:t>
+      </w:r>
+      <w:r>
+        <w:rPr>
+          <w:rFonts w:ascii="Times New Roman" w:hAnsi="Times New Roman" w:cs="Times New Roman"/>
+        </w:rPr>
+        <w:t xml:space="preserve"> down to just the one watering task</w:t>
+      </w:r>
+      <w:r>
+        <w:rPr>
+          <w:rFonts w:ascii="Times New Roman" w:hAnsi="Times New Roman" w:cs="Times New Roman"/>
+        </w:rPr>
+        <w:t>, cosmetics were removed, and an inventory</w:t>
+      </w:r>
+      <w:r>
+        <w:rPr>
+          <w:rFonts w:ascii="Times New Roman" w:hAnsi="Times New Roman" w:cs="Times New Roman"/>
+        </w:rPr>
+        <w:t xml:space="preserve"> system was scrapped. Aspects of the Inventory survive in the Save Manager, which is not mentioned here as has little to nothing to do with how the game functions, and more serves as a bridge to handle saving data between play sessions. I considered that feature to be non-functional for a project, but it does help the game feel more professional, even if it came at the cost of my sanity when implementing it.</w:t>
+      </w:r>
+    </w:p>
+    <w:p>
+      <w:pPr>
+        <w:rPr>
+          <w:rFonts w:ascii="Times New Roman" w:hAnsi="Times New Roman" w:cs="Times New Roman"/>
+        </w:rPr>
+      </w:pPr>
+      <w:r>
+        <w:rPr>
+          <w:rFonts w:ascii="Times New Roman" w:hAnsi="Times New Roman" w:cs="Times New Roman"/>
+        </w:rPr>
+        <w:tab/>
+        <w:t>In practice, this diagram was more of a guide, as communication between these systems did not always match the guide.</w:t>
+      </w:r>
+      <w:r>
+        <w:rPr>
+          <w:rFonts w:ascii="Times New Roman" w:hAnsi="Times New Roman" w:cs="Times New Roman"/>
+        </w:rPr>
+        <w:t xml:space="preserve"> The final diagram shown below more accurately depicts the final version of the system architecture. The system is more centralized around the Game Manager than before, with most objects talking to it directly.</w:t>
+      </w:r>
+      <w:r>
+        <w:rPr>
+          <w:rFonts w:ascii="Times New Roman" w:hAnsi="Times New Roman" w:cs="Times New Roman"/>
+        </w:rPr>
+        <w:t xml:space="preserve"> The ShopManager, replacing Store, also communicates directly with the UI, though that was mostly a convenience. I think with some </w:t>
+      </w:r>
+      <w:r>
+        <w:rPr>
+          <w:rFonts w:ascii="Times New Roman" w:hAnsi="Times New Roman" w:cs="Times New Roman"/>
+        </w:rPr>
+        <w:lastRenderedPageBreak/>
+        <w:t>refactoring those functions could be placed in GameManager,</w:t>
+      </w:r>
+      <w:r>
+        <w:rPr>
+          <w:rFonts w:ascii="Times New Roman" w:hAnsi="Times New Roman" w:cs="Times New Roman"/>
+        </w:rPr>
+        <w:t xml:space="preserve"> though the ShopManager itself is a class the GameManager object in Unity also possesses.</w:t>
+      </w:r>
+    </w:p>
+    <w:p>
+      <w:pPr>
+        <w:jc w:val="center"/>
+        <w:rPr>
+          <w:rFonts w:ascii="Times New Roman" w:hAnsi="Times New Roman" w:cs="Times New Roman"/>
+        </w:rPr>
+      </w:pPr>
+      <w:r>
+        <w:rPr>
+          <w:rFonts w:ascii="Times New Roman" w:hAnsi="Times New Roman" w:cs="Times New Roman"/>
+          <w:noProof/>
+        </w:rPr>
+        <w:drawing>
+          <wp:inline distT="0" distB="0" distL="0" distR="0" wp14:anchorId="69E6C3ED" wp14:editId="7DA86805">
+            <wp:extent cx="5943600" cy="4457700"/>
+            <wp:effectExtent l="0" t="0" r="0" b="0"/>
+            <wp:docPr id="1151322256" name="Picture 3"/>
+            <wp:cNvGraphicFramePr>
+              <a:graphicFrameLocks xmlns:a="http://schemas.openxmlformats.org/drawingml/2006/main" noChangeAspect="1"/>
+            </wp:cNvGraphicFramePr>
+            <a:graphic xmlns:a="http://schemas.openxmlformats.org/drawingml/2006/main">
+              <a:graphicData uri="http://schemas.openxmlformats.org/drawingml/2006/picture">
+                <pic:pic xmlns:pic="http://schemas.openxmlformats.org/drawingml/2006/picture">
+                  <pic:nvPicPr>
+                    <pic:cNvPr id="1151322256" name="Picture 1151322256"/>
+                    <pic:cNvPicPr/>
+                  </pic:nvPicPr>
+                  <pic:blipFill>
+                    <a:blip r:embed="rId9">
+                      <a:extLst>
+                        <a:ext uri="{28A0092B-C50C-407E-A947-70E740481C1C}">
+                          <a14:useLocalDpi xmlns:a14="http://schemas.microsoft.com/office/drawing/2010/main" val="0"/>
+                        </a:ext>
+                      </a:extLst>
+                    </a:blip>
+                    <a:stretch>
+                      <a:fillRect/>
+                    </a:stretch>
+                  </pic:blipFill>
+                  <pic:spPr>
+                    <a:xfrm>
+                      <a:off x="0" y="0"/>
+                      <a:ext cx="5943600" cy="4457700"/>
+                    </a:xfrm>
+                    <a:prstGeom prst="rect">
+                      <a:avLst/>
+                    </a:prstGeom>
+                  </pic:spPr>
+                </pic:pic>
+              </a:graphicData>
+            </a:graphic>
+          </wp:inline>
+        </w:drawing>
+      </w:r>
+    </w:p>
+    <w:p>
+      <w:pPr>
+        <w:rPr>
+          <w:rFonts w:ascii="Times New Roman" w:hAnsi="Times New Roman" w:cs="Times New Roman"/>
+        </w:rPr>
+      </w:pPr>
+    </w:p>
+    <w:p>
+      <w:pPr>
+        <w:rPr>
+          <w:rFonts w:ascii="Times New Roman" w:hAnsi="Times New Roman" w:cs="Times New Roman"/>
+        </w:rPr>
+      </w:pPr>
+    </w:p>
+    <w:p>
+      <w:pPr>
+        <w:rPr>
+          <w:rFonts w:ascii="Times New Roman" w:hAnsi="Times New Roman" w:cs="Times New Roman"/>
+        </w:rPr>
+      </w:pPr>
+    </w:p>
+    <w:p>
+      <w:pPr>
+        <w:rPr>
+          <w:rFonts w:ascii="Times New Roman" w:hAnsi="Times New Roman" w:cs="Times New Roman"/>
+        </w:rPr>
+      </w:pPr>
+    </w:p>
+    <w:p>
+      <w:pPr>
+        <w:rPr>
+          <w:rFonts w:ascii="Times New Roman" w:hAnsi="Times New Roman" w:cs="Times New Roman"/>
+        </w:rPr>
+      </w:pPr>
+    </w:p>
+    <w:p>
+      <w:pPr>
+        <w:rPr>
+          <w:rFonts w:ascii="Times New Roman" w:hAnsi="Times New Roman" w:cs="Times New Roman"/>
+        </w:rPr>
+      </w:pPr>
+    </w:p>
+    <w:p>
+      <w:pPr>
+        <w:rPr>
+          <w:rFonts w:ascii="Times New Roman" w:hAnsi="Times New Roman" w:cs="Times New Roman"/>
+        </w:rPr>
+      </w:pPr>
+    </w:p>
+    <w:p>
+      <w:pPr>
+        <w:rPr>
+          <w:rFonts w:ascii="Times New Roman" w:hAnsi="Times New Roman" w:cs="Times New Roman"/>
+        </w:rPr>
+      </w:pPr>
+    </w:p>
+    <w:p>
+      <w:pPr>
+        <w:rPr>
+          <w:rFonts w:ascii="Times New Roman" w:hAnsi="Times New Roman" w:cs="Times New Roman"/>
+        </w:rPr>
+      </w:pPr>
     </w:p>
     <w:p>
       <w:pPr>
@@ -1972,53 +2414,10 @@
           <w:sz w:val="28"/>
           <w:szCs w:val="28"/>
         </w:rPr>
+        <w:lastRenderedPageBreak/>
         <w:t>Methodology</w:t>
       </w:r>
-    </w:p>
-    <w:p>
-      <w:pPr>
-        <w:rPr>
-          <w:rFonts w:ascii="Times New Roman" w:hAnsi="Times New Roman" w:cs="Times New Roman"/>
-        </w:rPr>
-      </w:pPr>
-      <w:r>
-        <w:rPr>
-          <w:rFonts w:ascii="Times New Roman" w:hAnsi="Times New Roman" w:cs="Times New Roman"/>
-        </w:rPr>
-        <w:tab/>
-        <w:t>Everything at the prototype and after goes here, similarly a large section. Talk about the window, and how I set it up to interact with the Windows API.</w:t>
-      </w:r>
-      <w:r>
-        <w:rPr>
-          <w:rFonts w:ascii="Times New Roman" w:hAnsi="Times New Roman" w:cs="Times New Roman"/>
-        </w:rPr>
-        <w:t xml:space="preserve"> Talk in depth about the game’s internal logic, and tie back to the design section to bring up why certain choices were made. Examples include the task system and why so much time has to pass between events.</w:t>
-      </w:r>
-    </w:p>
-    <w:p>
-      <w:pPr>
-        <w:rPr>
-          <w:rFonts w:ascii="Times New Roman" w:hAnsi="Times New Roman" w:cs="Times New Roman"/>
-        </w:rPr>
-      </w:pPr>
-      <w:r>
-        <w:rPr>
-          <w:rFonts w:ascii="Times New Roman" w:hAnsi="Times New Roman" w:cs="Times New Roman"/>
-          <w:b/>
-          <w:bCs/>
-        </w:rPr>
-        <w:t>Subsection on changes in methodology after testing?</w:t>
-      </w:r>
-    </w:p>
-    <w:p>
-      <w:pPr>
-        <w:rPr>
-          <w:rFonts w:ascii="Times New Roman" w:hAnsi="Times New Roman" w:cs="Times New Roman"/>
-        </w:rPr>
-      </w:pPr>
-    </w:p>
-    <w:p>
-      <w:pPr>
+      <w:r>
         <w:rPr>
           <w:rFonts w:ascii="Times New Roman" w:hAnsi="Times New Roman" w:cs="Times New Roman"/>
           <w:b/>
@@ -2026,8 +2425,670 @@
           <w:sz w:val="28"/>
           <w:szCs w:val="28"/>
         </w:rPr>
-      </w:pPr>
-      <w:r>
+        <w:t xml:space="preserve"> &amp; Implementation</w:t>
+      </w:r>
+    </w:p>
+    <w:p>
+      <w:pPr>
+        <w:rPr>
+          <w:rFonts w:ascii="Times New Roman" w:hAnsi="Times New Roman" w:cs="Times New Roman"/>
+        </w:rPr>
+      </w:pPr>
+      <w:r>
+        <w:rPr>
+          <w:rFonts w:ascii="Times New Roman" w:hAnsi="Times New Roman" w:cs="Times New Roman"/>
+        </w:rPr>
+        <w:tab/>
+      </w:r>
+      <w:r>
+        <w:rPr>
+          <w:rFonts w:ascii="Times New Roman" w:hAnsi="Times New Roman" w:cs="Times New Roman"/>
+        </w:rPr>
+        <w:t xml:space="preserve">The first step of the implementation of this system was simply making sure I could create a corner game in the first place. Setting up the window was the first major roadblock, as I’d be communicating with the Windows API. This does unfortunately mean the game only works on Windows, </w:t>
+      </w:r>
+      <w:r>
+        <w:rPr>
+          <w:rFonts w:ascii="Times New Roman" w:hAnsi="Times New Roman" w:cs="Times New Roman"/>
+        </w:rPr>
+        <w:t>and it likely only works on 32-bit systems, though that I am not fully sure of. In summary, the game sets a reference for its window, finds the monitor’s work area, positions itself in the bottom right corner, makes its background transparent and removes its header and borders to make the game seamlessly appear just above the user’s hotbar. This</w:t>
+      </w:r>
+      <w:r>
+        <w:rPr>
+          <w:rFonts w:ascii="Times New Roman" w:hAnsi="Times New Roman" w:cs="Times New Roman"/>
+        </w:rPr>
+        <w:t xml:space="preserve"> was done in a single C# script, and it only runs when the game is run in Windows outside the Unity editor. On any incompatible system the game may still run, but it </w:t>
+      </w:r>
+      <w:r>
+        <w:rPr>
+          <w:rFonts w:ascii="Times New Roman" w:hAnsi="Times New Roman" w:cs="Times New Roman"/>
+        </w:rPr>
+        <w:t>probably will not</w:t>
+      </w:r>
+      <w:r>
+        <w:rPr>
+          <w:rFonts w:ascii="Times New Roman" w:hAnsi="Times New Roman" w:cs="Times New Roman"/>
+        </w:rPr>
+        <w:t xml:space="preserve"> configure its window properly.</w:t>
+      </w:r>
+    </w:p>
+    <w:p>
+      <w:pPr>
+        <w:rPr>
+          <w:rFonts w:ascii="Times New Roman" w:hAnsi="Times New Roman" w:cs="Times New Roman"/>
+        </w:rPr>
+      </w:pPr>
+      <w:r>
+        <w:rPr>
+          <w:rFonts w:ascii="Times New Roman" w:hAnsi="Times New Roman" w:cs="Times New Roman"/>
+        </w:rPr>
+        <w:tab/>
+        <w:t xml:space="preserve">After this, I had to incorporate the architecture discussed in the Design section. I began relearning Unity from scratch, using some old projects I made in classes as a baseline to relearn some of its features. </w:t>
+      </w:r>
+      <w:r>
+        <w:rPr>
+          <w:rFonts w:ascii="Times New Roman" w:hAnsi="Times New Roman" w:cs="Times New Roman"/>
+        </w:rPr>
+        <w:t>Granted, not many of those projects translated well as they were done in Unity 3D.</w:t>
+      </w:r>
+      <w:r>
+        <w:rPr>
+          <w:rFonts w:ascii="Times New Roman" w:hAnsi="Times New Roman" w:cs="Times New Roman"/>
+        </w:rPr>
+        <w:t xml:space="preserve"> Most of the project was going back and forth, hard coding instances of objects then refactoring them into a new structure that was easy to reverse engineer and add to. An example of this is the plant itself, for my partial demo</w:t>
+      </w:r>
+      <w:r>
+        <w:rPr>
+          <w:rFonts w:ascii="Times New Roman" w:hAnsi="Times New Roman" w:cs="Times New Roman"/>
+        </w:rPr>
+        <w:t xml:space="preserve"> I simply hard coded an instance of a plant, but for the final demo I</w:t>
+      </w:r>
+      <w:r>
+        <w:rPr>
+          <w:rFonts w:ascii="Times New Roman" w:hAnsi="Times New Roman" w:cs="Times New Roman"/>
+        </w:rPr>
+        <w:t xml:space="preserve"> instead have a PlantData class that allows developers to simply attach the necessary sprites for the plant stages and integers for how much watering they need to reach said stages. </w:t>
+      </w:r>
+      <w:r>
+        <w:rPr>
+          <w:rFonts w:ascii="Times New Roman" w:hAnsi="Times New Roman" w:cs="Times New Roman"/>
+        </w:rPr>
+        <w:t>From there, adding new plants is simple, though it did require making new sprites for each stage.</w:t>
+      </w:r>
+    </w:p>
+    <w:p>
+      <w:pPr>
+        <w:rPr>
+          <w:rFonts w:ascii="Times New Roman" w:hAnsi="Times New Roman" w:cs="Times New Roman"/>
+        </w:rPr>
+      </w:pPr>
+      <w:r>
+        <w:rPr>
+          <w:rFonts w:ascii="Times New Roman" w:hAnsi="Times New Roman" w:cs="Times New Roman"/>
+        </w:rPr>
+        <w:tab/>
+        <w:t xml:space="preserve">I used the online sprite editor </w:t>
+      </w:r>
+      <w:r>
+        <w:rPr>
+          <w:rFonts w:ascii="Times New Roman" w:hAnsi="Times New Roman" w:cs="Times New Roman"/>
+          <w:i/>
+          <w:iCs/>
+        </w:rPr>
+        <w:t>Piskel</w:t>
+      </w:r>
+      <w:r>
+        <w:rPr>
+          <w:rFonts w:ascii="Times New Roman" w:hAnsi="Times New Roman" w:cs="Times New Roman"/>
+        </w:rPr>
+        <w:t xml:space="preserve"> to create my sprites, as I was already familiar with the system, though I haven’t used it in years. Using it, I created the sprites for the plants, table, menus, buttons, etc.</w:t>
+      </w:r>
+      <w:r>
+        <w:rPr>
+          <w:rFonts w:ascii="Times New Roman" w:hAnsi="Times New Roman" w:cs="Times New Roman"/>
+        </w:rPr>
+        <w:t xml:space="preserve"> As I mention at the end of my README.md, the font I used</w:t>
+      </w:r>
+      <w:r>
+        <w:rPr>
+          <w:rFonts w:ascii="Times New Roman" w:hAnsi="Times New Roman" w:cs="Times New Roman"/>
+        </w:rPr>
+        <w:t xml:space="preserve"> was the sole asset I did not create myself, though many of my sprites were made with references to other free assets, albeit with my own touches to them.</w:t>
+      </w:r>
+    </w:p>
+    <w:p>
+      <w:pPr>
+        <w:jc w:val="center"/>
+        <w:rPr>
+          <w:rFonts w:ascii="Times New Roman" w:hAnsi="Times New Roman" w:cs="Times New Roman"/>
+        </w:rPr>
+      </w:pPr>
+      <w:r>
+        <w:rPr>
+          <w:rFonts w:ascii="Times New Roman" w:hAnsi="Times New Roman" w:cs="Times New Roman"/>
+          <w:noProof/>
+        </w:rPr>
+        <w:drawing>
+          <wp:inline distT="0" distB="0" distL="0" distR="0" wp14:anchorId="1249E2F0" wp14:editId="3CF4C806">
+            <wp:extent cx="952500" cy="476250"/>
+            <wp:effectExtent l="0" t="0" r="0" b="0"/>
+            <wp:docPr id="613164607" name="Picture 4"/>
+            <wp:cNvGraphicFramePr>
+              <a:graphicFrameLocks xmlns:a="http://schemas.openxmlformats.org/drawingml/2006/main" noChangeAspect="1"/>
+            </wp:cNvGraphicFramePr>
+            <a:graphic xmlns:a="http://schemas.openxmlformats.org/drawingml/2006/main">
+              <a:graphicData uri="http://schemas.openxmlformats.org/drawingml/2006/picture">
+                <pic:pic xmlns:pic="http://schemas.openxmlformats.org/drawingml/2006/picture">
+                  <pic:nvPicPr>
+                    <pic:cNvPr id="613164607" name="Picture 613164607"/>
+                    <pic:cNvPicPr/>
+                  </pic:nvPicPr>
+                  <pic:blipFill>
+                    <a:blip r:embed="rId10">
+                      <a:extLst>
+                        <a:ext uri="{28A0092B-C50C-407E-A947-70E740481C1C}">
+                          <a14:useLocalDpi xmlns:a14="http://schemas.microsoft.com/office/drawing/2010/main" val="0"/>
+                        </a:ext>
+                      </a:extLst>
+                    </a:blip>
+                    <a:stretch>
+                      <a:fillRect/>
+                    </a:stretch>
+                  </pic:blipFill>
+                  <pic:spPr>
+                    <a:xfrm>
+                      <a:off x="0" y="0"/>
+                      <a:ext cx="952500" cy="476250"/>
+                    </a:xfrm>
+                    <a:prstGeom prst="rect">
+                      <a:avLst/>
+                    </a:prstGeom>
+                  </pic:spPr>
+                </pic:pic>
+              </a:graphicData>
+            </a:graphic>
+          </wp:inline>
+        </w:drawing>
+      </w:r>
+      <w:r>
+        <w:rPr>
+          <w:rFonts w:ascii="Times New Roman" w:hAnsi="Times New Roman" w:cs="Times New Roman"/>
+          <w:noProof/>
+        </w:rPr>
+        <w:drawing>
+          <wp:inline distT="0" distB="0" distL="0" distR="0" wp14:anchorId="7E108946" wp14:editId="530938E1">
+            <wp:extent cx="952500" cy="476250"/>
+            <wp:effectExtent l="0" t="0" r="0" b="0"/>
+            <wp:docPr id="1942635241" name="Picture 5"/>
+            <wp:cNvGraphicFramePr>
+              <a:graphicFrameLocks xmlns:a="http://schemas.openxmlformats.org/drawingml/2006/main" noChangeAspect="1"/>
+            </wp:cNvGraphicFramePr>
+            <a:graphic xmlns:a="http://schemas.openxmlformats.org/drawingml/2006/main">
+              <a:graphicData uri="http://schemas.openxmlformats.org/drawingml/2006/picture">
+                <pic:pic xmlns:pic="http://schemas.openxmlformats.org/drawingml/2006/picture">
+                  <pic:nvPicPr>
+                    <pic:cNvPr id="1942635241" name="Picture 1942635241"/>
+                    <pic:cNvPicPr/>
+                  </pic:nvPicPr>
+                  <pic:blipFill>
+                    <a:blip r:embed="rId11">
+                      <a:extLst>
+                        <a:ext uri="{28A0092B-C50C-407E-A947-70E740481C1C}">
+                          <a14:useLocalDpi xmlns:a14="http://schemas.microsoft.com/office/drawing/2010/main" val="0"/>
+                        </a:ext>
+                      </a:extLst>
+                    </a:blip>
+                    <a:stretch>
+                      <a:fillRect/>
+                    </a:stretch>
+                  </pic:blipFill>
+                  <pic:spPr>
+                    <a:xfrm>
+                      <a:off x="0" y="0"/>
+                      <a:ext cx="952500" cy="476250"/>
+                    </a:xfrm>
+                    <a:prstGeom prst="rect">
+                      <a:avLst/>
+                    </a:prstGeom>
+                  </pic:spPr>
+                </pic:pic>
+              </a:graphicData>
+            </a:graphic>
+          </wp:inline>
+        </w:drawing>
+      </w:r>
+      <w:r>
+        <w:rPr>
+          <w:rFonts w:ascii="Times New Roman" w:hAnsi="Times New Roman" w:cs="Times New Roman"/>
+          <w:noProof/>
+        </w:rPr>
+        <w:drawing>
+          <wp:inline distT="0" distB="0" distL="0" distR="0" wp14:anchorId="388C2DF0" wp14:editId="2E663F41">
+            <wp:extent cx="1428750" cy="476250"/>
+            <wp:effectExtent l="0" t="0" r="0" b="0"/>
+            <wp:docPr id="822447915" name="Picture 6"/>
+            <wp:cNvGraphicFramePr>
+              <a:graphicFrameLocks xmlns:a="http://schemas.openxmlformats.org/drawingml/2006/main" noChangeAspect="1"/>
+            </wp:cNvGraphicFramePr>
+            <a:graphic xmlns:a="http://schemas.openxmlformats.org/drawingml/2006/main">
+              <a:graphicData uri="http://schemas.openxmlformats.org/drawingml/2006/picture">
+                <pic:pic xmlns:pic="http://schemas.openxmlformats.org/drawingml/2006/picture">
+                  <pic:nvPicPr>
+                    <pic:cNvPr id="822447915" name="Picture 822447915"/>
+                    <pic:cNvPicPr/>
+                  </pic:nvPicPr>
+                  <pic:blipFill>
+                    <a:blip r:embed="rId12">
+                      <a:extLst>
+                        <a:ext uri="{28A0092B-C50C-407E-A947-70E740481C1C}">
+                          <a14:useLocalDpi xmlns:a14="http://schemas.microsoft.com/office/drawing/2010/main" val="0"/>
+                        </a:ext>
+                      </a:extLst>
+                    </a:blip>
+                    <a:stretch>
+                      <a:fillRect/>
+                    </a:stretch>
+                  </pic:blipFill>
+                  <pic:spPr>
+                    <a:xfrm>
+                      <a:off x="0" y="0"/>
+                      <a:ext cx="1428750" cy="476250"/>
+                    </a:xfrm>
+                    <a:prstGeom prst="rect">
+                      <a:avLst/>
+                    </a:prstGeom>
+                  </pic:spPr>
+                </pic:pic>
+              </a:graphicData>
+            </a:graphic>
+          </wp:inline>
+        </w:drawing>
+      </w:r>
+      <w:r>
+        <w:rPr>
+          <w:rFonts w:ascii="Times New Roman" w:hAnsi="Times New Roman" w:cs="Times New Roman"/>
+          <w:noProof/>
+        </w:rPr>
+        <w:drawing>
+          <wp:inline distT="0" distB="0" distL="0" distR="0" wp14:anchorId="4A3D5AA2" wp14:editId="39405C99">
+            <wp:extent cx="457200" cy="457200"/>
+            <wp:effectExtent l="0" t="0" r="0" b="0"/>
+            <wp:docPr id="42489988" name="Picture 7"/>
+            <wp:cNvGraphicFramePr>
+              <a:graphicFrameLocks xmlns:a="http://schemas.openxmlformats.org/drawingml/2006/main" noChangeAspect="1"/>
+            </wp:cNvGraphicFramePr>
+            <a:graphic xmlns:a="http://schemas.openxmlformats.org/drawingml/2006/main">
+              <a:graphicData uri="http://schemas.openxmlformats.org/drawingml/2006/picture">
+                <pic:pic xmlns:pic="http://schemas.openxmlformats.org/drawingml/2006/picture">
+                  <pic:nvPicPr>
+                    <pic:cNvPr id="42489988" name="Picture 42489988"/>
+                    <pic:cNvPicPr/>
+                  </pic:nvPicPr>
+                  <pic:blipFill>
+                    <a:blip r:embed="rId13">
+                      <a:extLst>
+                        <a:ext uri="{28A0092B-C50C-407E-A947-70E740481C1C}">
+                          <a14:useLocalDpi xmlns:a14="http://schemas.microsoft.com/office/drawing/2010/main" val="0"/>
+                        </a:ext>
+                      </a:extLst>
+                    </a:blip>
+                    <a:stretch>
+                      <a:fillRect/>
+                    </a:stretch>
+                  </pic:blipFill>
+                  <pic:spPr>
+                    <a:xfrm>
+                      <a:off x="0" y="0"/>
+                      <a:ext cx="457200" cy="457200"/>
+                    </a:xfrm>
+                    <a:prstGeom prst="rect">
+                      <a:avLst/>
+                    </a:prstGeom>
+                  </pic:spPr>
+                </pic:pic>
+              </a:graphicData>
+            </a:graphic>
+          </wp:inline>
+        </w:drawing>
+      </w:r>
+      <w:r>
+        <w:rPr>
+          <w:rFonts w:ascii="Times New Roman" w:hAnsi="Times New Roman" w:cs="Times New Roman"/>
+          <w:noProof/>
+        </w:rPr>
+        <w:drawing>
+          <wp:inline distT="0" distB="0" distL="0" distR="0" wp14:anchorId="30E2A9EB" wp14:editId="6B79C20F">
+            <wp:extent cx="609600" cy="609600"/>
+            <wp:effectExtent l="0" t="0" r="0" b="0"/>
+            <wp:docPr id="22358032" name="Picture 8"/>
+            <wp:cNvGraphicFramePr>
+              <a:graphicFrameLocks xmlns:a="http://schemas.openxmlformats.org/drawingml/2006/main" noChangeAspect="1"/>
+            </wp:cNvGraphicFramePr>
+            <a:graphic xmlns:a="http://schemas.openxmlformats.org/drawingml/2006/main">
+              <a:graphicData uri="http://schemas.openxmlformats.org/drawingml/2006/picture">
+                <pic:pic xmlns:pic="http://schemas.openxmlformats.org/drawingml/2006/picture">
+                  <pic:nvPicPr>
+                    <pic:cNvPr id="22358032" name="Picture 22358032"/>
+                    <pic:cNvPicPr/>
+                  </pic:nvPicPr>
+                  <pic:blipFill>
+                    <a:blip r:embed="rId14">
+                      <a:extLst>
+                        <a:ext uri="{28A0092B-C50C-407E-A947-70E740481C1C}">
+                          <a14:useLocalDpi xmlns:a14="http://schemas.microsoft.com/office/drawing/2010/main" val="0"/>
+                        </a:ext>
+                      </a:extLst>
+                    </a:blip>
+                    <a:stretch>
+                      <a:fillRect/>
+                    </a:stretch>
+                  </pic:blipFill>
+                  <pic:spPr>
+                    <a:xfrm>
+                      <a:off x="0" y="0"/>
+                      <a:ext cx="609600" cy="609600"/>
+                    </a:xfrm>
+                    <a:prstGeom prst="rect">
+                      <a:avLst/>
+                    </a:prstGeom>
+                  </pic:spPr>
+                </pic:pic>
+              </a:graphicData>
+            </a:graphic>
+          </wp:inline>
+        </w:drawing>
+      </w:r>
+    </w:p>
+    <w:p>
+      <w:pPr>
+        <w:jc w:val="center"/>
+        <w:rPr>
+          <w:rFonts w:ascii="Times New Roman" w:hAnsi="Times New Roman" w:cs="Times New Roman"/>
+          <w:i/>
+          <w:iCs/>
+        </w:rPr>
+      </w:pPr>
+      <w:r>
+        <w:rPr>
+          <w:rFonts w:ascii="Times New Roman" w:hAnsi="Times New Roman" w:cs="Times New Roman"/>
+          <w:i/>
+          <w:iCs/>
+        </w:rPr>
+        <w:t>Some examples of the assets I put together in Piskel</w:t>
+      </w:r>
+    </w:p>
+    <w:p>
+      <w:pPr>
+        <w:rPr>
+          <w:rFonts w:ascii="Times New Roman" w:hAnsi="Times New Roman" w:cs="Times New Roman"/>
+        </w:rPr>
+      </w:pPr>
+      <w:r>
+        <w:rPr>
+          <w:rFonts w:ascii="Times New Roman" w:hAnsi="Times New Roman" w:cs="Times New Roman"/>
+        </w:rPr>
+        <w:tab/>
+        <w:t xml:space="preserve">I frequently made use of the Singleton pattern in my game to help me handle references to other objects. Unity helps </w:t>
+      </w:r>
+      <w:r>
+        <w:rPr>
+          <w:rFonts w:ascii="Times New Roman" w:hAnsi="Times New Roman" w:cs="Times New Roman"/>
+        </w:rPr>
+        <w:t>with declaring an object as the instance in the case of using this pattern, making said instance a public object that any script can reference easily so long as only one exists. I used this on the Game and Save Managers to</w:t>
+      </w:r>
+      <w:r>
+        <w:rPr>
+          <w:rFonts w:ascii="Times New Roman" w:hAnsi="Times New Roman" w:cs="Times New Roman"/>
+        </w:rPr>
+        <w:t xml:space="preserve"> help manage referencing them, as most objects would want to communicate with the center of the architecture, and would want to reference the Save </w:t>
+      </w:r>
+      <w:r>
+        <w:rPr>
+          <w:rFonts w:ascii="Times New Roman" w:hAnsi="Times New Roman" w:cs="Times New Roman"/>
+        </w:rPr>
+        <w:t>M</w:t>
+      </w:r>
+      <w:r>
+        <w:rPr>
+          <w:rFonts w:ascii="Times New Roman" w:hAnsi="Times New Roman" w:cs="Times New Roman"/>
+        </w:rPr>
+        <w:t xml:space="preserve">anager </w:t>
+      </w:r>
+      <w:r>
+        <w:rPr>
+          <w:rFonts w:ascii="Times New Roman" w:hAnsi="Times New Roman" w:cs="Times New Roman"/>
+        </w:rPr>
+        <w:t>to</w:t>
+      </w:r>
+      <w:r>
+        <w:rPr>
+          <w:rFonts w:ascii="Times New Roman" w:hAnsi="Times New Roman" w:cs="Times New Roman"/>
+        </w:rPr>
+        <w:t xml:space="preserve"> ensure that progress persists between play </w:t>
+      </w:r>
+      <w:r>
+        <w:rPr>
+          <w:rFonts w:ascii="Times New Roman" w:hAnsi="Times New Roman" w:cs="Times New Roman"/>
+        </w:rPr>
+        <w:t>sessions</w:t>
+      </w:r>
+      <w:r>
+        <w:rPr>
+          <w:rFonts w:ascii="Times New Roman" w:hAnsi="Times New Roman" w:cs="Times New Roman"/>
+        </w:rPr>
+        <w:t>.</w:t>
+      </w:r>
+    </w:p>
+    <w:p>
+      <w:pPr>
+        <w:rPr>
+          <w:rFonts w:ascii="Times New Roman" w:hAnsi="Times New Roman" w:cs="Times New Roman"/>
+        </w:rPr>
+      </w:pPr>
+      <w:r>
+        <w:rPr>
+          <w:rFonts w:ascii="Times New Roman" w:hAnsi="Times New Roman" w:cs="Times New Roman"/>
+        </w:rPr>
+        <w:lastRenderedPageBreak/>
+        <w:tab/>
+      </w:r>
+      <w:r>
+        <w:rPr>
+          <w:rFonts w:ascii="Times New Roman" w:hAnsi="Times New Roman" w:cs="Times New Roman"/>
+        </w:rPr>
+        <w:t>The Save Manager was largely needed to preserve the game’s progression system: selling plants allows the user to accumulate money, which can then grow into upgrades that lead to growing plants even faster, which helps afford the scaling costs of upgrades. As of now these upgrades have no upper cap, though they should be implemented at some point in the future to prevent the item costs from extending beyond the buttons they are attached to.</w:t>
+      </w:r>
+    </w:p>
+    <w:p>
+      <w:pPr>
+        <w:rPr>
+          <w:rFonts w:ascii="Times New Roman" w:hAnsi="Times New Roman" w:cs="Times New Roman"/>
+        </w:rPr>
+      </w:pPr>
+      <w:r>
+        <w:rPr>
+          <w:rFonts w:ascii="Times New Roman" w:hAnsi="Times New Roman" w:cs="Times New Roman"/>
+        </w:rPr>
+        <w:tab/>
+        <w:t xml:space="preserve">There are only two plants in this version, as without a team I am unable to incorporate more of them without cutting into the time it would take to </w:t>
+      </w:r>
+      <w:r>
+        <w:rPr>
+          <w:rFonts w:ascii="Times New Roman" w:hAnsi="Times New Roman" w:cs="Times New Roman"/>
+        </w:rPr>
+        <w:t>program</w:t>
+      </w:r>
+      <w:r>
+        <w:rPr>
+          <w:rFonts w:ascii="Times New Roman" w:hAnsi="Times New Roman" w:cs="Times New Roman"/>
+        </w:rPr>
+        <w:t xml:space="preserve"> the game. </w:t>
+      </w:r>
+      <w:r>
+        <w:rPr>
+          <w:rFonts w:ascii="Times New Roman" w:hAnsi="Times New Roman" w:cs="Times New Roman"/>
+        </w:rPr>
+        <w:t xml:space="preserve">As I mentioned before, the focus was on making something that could easily be expanded into a commercial game by providing the groundwork. </w:t>
+      </w:r>
+      <w:r>
+        <w:rPr>
+          <w:rFonts w:ascii="Times New Roman" w:hAnsi="Times New Roman" w:cs="Times New Roman"/>
+        </w:rPr>
+        <w:t>Or, to put it into the parlance of my game, I tilled and fertilized the soil</w:t>
+      </w:r>
+      <w:r>
+        <w:rPr>
+          <w:rFonts w:ascii="Times New Roman" w:hAnsi="Times New Roman" w:cs="Times New Roman"/>
+        </w:rPr>
+        <w:t>. Adding plants is as simple as configuring a new PlantData object in the Unity Editor, and the money system can easily be incorporated into new shops and ideas.</w:t>
+      </w:r>
+      <w:r>
+        <w:rPr>
+          <w:rFonts w:ascii="Times New Roman" w:hAnsi="Times New Roman" w:cs="Times New Roman"/>
+        </w:rPr>
+        <w:t xml:space="preserve"> The task handling functions can easily be expanded to fit several </w:t>
+      </w:r>
+      <w:r>
+        <w:rPr>
+          <w:rFonts w:ascii="Times New Roman" w:hAnsi="Times New Roman" w:cs="Times New Roman"/>
+        </w:rPr>
+        <w:t>tasks because of how they are implemented; the water button doesn’t talk to the plant directly, it talks to the GameManager, which checks upgrades</w:t>
+      </w:r>
+      <w:r>
+        <w:rPr>
+          <w:rFonts w:ascii="Times New Roman" w:hAnsi="Times New Roman" w:cs="Times New Roman"/>
+        </w:rPr>
+        <w:t xml:space="preserve">, and then passes a value to the plant. New tasks can easily just consult whatever functions they need.  </w:t>
+      </w:r>
+      <w:r>
+        <w:rPr>
+          <w:rFonts w:ascii="Times New Roman" w:hAnsi="Times New Roman" w:cs="Times New Roman"/>
+        </w:rPr>
+        <w:t xml:space="preserve">Some functions have overloading implementations to catch cases that don’t </w:t>
+      </w:r>
+      <w:r>
+        <w:rPr>
+          <w:rFonts w:ascii="Times New Roman" w:hAnsi="Times New Roman" w:cs="Times New Roman"/>
+        </w:rPr>
+        <w:t>exist</w:t>
+      </w:r>
+      <w:r>
+        <w:rPr>
+          <w:rFonts w:ascii="Times New Roman" w:hAnsi="Times New Roman" w:cs="Times New Roman"/>
+        </w:rPr>
+        <w:t xml:space="preserve"> yet, such as having the plant initializer accept a specific value to plant a specific plant, or accept no value and create a rando plant from the list of available plants, as is the current implementation.</w:t>
+      </w:r>
+    </w:p>
+    <w:p>
+      <w:pPr>
+        <w:rPr>
+          <w:rFonts w:ascii="Times New Roman" w:hAnsi="Times New Roman" w:cs="Times New Roman"/>
+        </w:rPr>
+      </w:pPr>
+      <w:r>
+        <w:rPr>
+          <w:rFonts w:ascii="Times New Roman" w:hAnsi="Times New Roman" w:cs="Times New Roman"/>
+        </w:rPr>
+        <w:tab/>
+        <w:t xml:space="preserve">The design philosophy of this project wasn’t just to make the game work, but to design it as if I was working with a team who need to be able to understand and add to my work without consulting me directly. Given that objective, I think I succeeded, though it </w:t>
+      </w:r>
+      <w:r>
+        <w:rPr>
+          <w:rFonts w:ascii="Times New Roman" w:hAnsi="Times New Roman" w:cs="Times New Roman"/>
+        </w:rPr>
+        <w:t>d</w:t>
+      </w:r>
+      <w:r>
+        <w:rPr>
+          <w:rFonts w:ascii="Times New Roman" w:hAnsi="Times New Roman" w:cs="Times New Roman"/>
+        </w:rPr>
+        <w:t>id lead to me spending as much time, if not more rewriting items than I spent making them the first time.</w:t>
+      </w:r>
+      <w:r>
+        <w:rPr>
+          <w:rFonts w:ascii="Times New Roman" w:hAnsi="Times New Roman" w:cs="Times New Roman"/>
+        </w:rPr>
+        <w:t xml:space="preserve"> Still, for what is present in the game now, I am happy with the outcomes reached.</w:t>
+      </w:r>
+    </w:p>
+    <w:p>
+      <w:pPr>
+        <w:rPr>
+          <w:rFonts w:ascii="Times New Roman" w:hAnsi="Times New Roman" w:cs="Times New Roman"/>
+        </w:rPr>
+      </w:pPr>
+    </w:p>
+    <w:p>
+      <w:pPr>
+        <w:rPr>
+          <w:rFonts w:ascii="Times New Roman" w:hAnsi="Times New Roman" w:cs="Times New Roman"/>
+        </w:rPr>
+      </w:pPr>
+    </w:p>
+    <w:p>
+      <w:pPr>
+        <w:rPr>
+          <w:rFonts w:ascii="Times New Roman" w:hAnsi="Times New Roman" w:cs="Times New Roman"/>
+        </w:rPr>
+      </w:pPr>
+    </w:p>
+    <w:p>
+      <w:pPr>
+        <w:rPr>
+          <w:rFonts w:ascii="Times New Roman" w:hAnsi="Times New Roman" w:cs="Times New Roman"/>
+        </w:rPr>
+      </w:pPr>
+    </w:p>
+    <w:p>
+      <w:pPr>
+        <w:rPr>
+          <w:rFonts w:ascii="Times New Roman" w:hAnsi="Times New Roman" w:cs="Times New Roman"/>
+        </w:rPr>
+      </w:pPr>
+    </w:p>
+    <w:p>
+      <w:pPr>
+        <w:rPr>
+          <w:rFonts w:ascii="Times New Roman" w:hAnsi="Times New Roman" w:cs="Times New Roman"/>
+        </w:rPr>
+      </w:pPr>
+    </w:p>
+    <w:p>
+      <w:pPr>
+        <w:rPr>
+          <w:rFonts w:ascii="Times New Roman" w:hAnsi="Times New Roman" w:cs="Times New Roman"/>
+        </w:rPr>
+      </w:pPr>
+    </w:p>
+    <w:p>
+      <w:pPr>
+        <w:rPr>
+          <w:rFonts w:ascii="Times New Roman" w:hAnsi="Times New Roman" w:cs="Times New Roman"/>
+        </w:rPr>
+      </w:pPr>
+    </w:p>
+    <w:p>
+      <w:pPr>
+        <w:rPr>
+          <w:rFonts w:ascii="Times New Roman" w:hAnsi="Times New Roman" w:cs="Times New Roman"/>
+        </w:rPr>
+      </w:pPr>
+    </w:p>
+    <w:p>
+      <w:pPr>
+        <w:rPr>
+          <w:rFonts w:ascii="Times New Roman" w:hAnsi="Times New Roman" w:cs="Times New Roman"/>
+        </w:rPr>
+      </w:pPr>
+    </w:p>
+    <w:p>
+      <w:pPr>
+        <w:rPr>
+          <w:rFonts w:ascii="Times New Roman" w:hAnsi="Times New Roman" w:cs="Times New Roman"/>
+        </w:rPr>
+      </w:pPr>
+    </w:p>
+    <w:p>
+      <w:pPr>
         <w:rPr>
           <w:rFonts w:ascii="Times New Roman" w:hAnsi="Times New Roman" w:cs="Times New Roman"/>
           <w:b/>
@@ -2035,47 +3096,6 @@
           <w:sz w:val="28"/>
           <w:szCs w:val="28"/>
         </w:rPr>
-        <w:t>Testing</w:t>
-      </w:r>
-    </w:p>
-    <w:p>
-      <w:pPr>
-        <w:rPr>
-          <w:rFonts w:ascii="Times New Roman" w:hAnsi="Times New Roman" w:cs="Times New Roman"/>
-        </w:rPr>
-      </w:pPr>
-      <w:r>
-        <w:rPr>
-          <w:rFonts w:ascii="Times New Roman" w:hAnsi="Times New Roman" w:cs="Times New Roman"/>
-        </w:rPr>
-        <w:tab/>
-        <w:t>Here I’ll go over the playtesting methods used. Who was given demos, what they were asked to do, the survey questions asked, the playtesting I performed myself, and so on.</w:t>
-      </w:r>
-      <w:r>
-        <w:rPr>
-          <w:rFonts w:ascii="Times New Roman" w:hAnsi="Times New Roman" w:cs="Times New Roman"/>
-        </w:rPr>
-        <w:t xml:space="preserve"> I may consider making the Outcomes a subsection here and changing the Outcomes section into</w:t>
-      </w:r>
-      <w:r>
-        <w:rPr>
-          <w:rFonts w:ascii="Times New Roman" w:hAnsi="Times New Roman" w:cs="Times New Roman"/>
-        </w:rPr>
-        <w:t xml:space="preserve"> essentially a second round of the Methodology section.</w:t>
-      </w:r>
-    </w:p>
-    <w:p>
-      <w:pPr>
-        <w:rPr>
-          <w:rFonts w:ascii="Times New Roman" w:hAnsi="Times New Roman" w:cs="Times New Roman"/>
-        </w:rPr>
-      </w:pPr>
-    </w:p>
-    <w:p>
-      <w:pPr>
-        <w:rPr>
-          <w:rFonts w:ascii="Times New Roman" w:hAnsi="Times New Roman" w:cs="Times New Roman"/>
-        </w:rPr>
       </w:pPr>
       <w:r>
         <w:rPr>
@@ -2085,7 +3105,8 @@
           <w:sz w:val="28"/>
           <w:szCs w:val="28"/>
         </w:rPr>
-        <w:t>Outcomes</w:t>
+        <w:lastRenderedPageBreak/>
+        <w:t>Testing</w:t>
       </w:r>
     </w:p>
     <w:p>
@@ -2099,22 +3120,394 @@
           <w:rFonts w:ascii="Times New Roman" w:hAnsi="Times New Roman" w:cs="Times New Roman"/>
         </w:rPr>
         <w:tab/>
-        <w:t>What resulted from testing? What was done to change the final design after the demo? Was it informed by player feedback or by my own desires? This part may turn into a subsection, with this section being more focused on the design cycle. I essentially went through the pipeline again after testing, in order to incorporate feedback and my desired improvements.</w:t>
-      </w:r>
-    </w:p>
-    <w:p>
-      <w:pPr>
-        <w:rPr>
-          <w:rFonts w:ascii="Times New Roman" w:hAnsi="Times New Roman" w:cs="Times New Roman"/>
-        </w:rPr>
-      </w:pPr>
-    </w:p>
-    <w:p>
-      <w:pPr>
-        <w:rPr>
-          <w:rFonts w:ascii="Times New Roman" w:hAnsi="Times New Roman" w:cs="Times New Roman"/>
-          <w:sz w:val="28"/>
-          <w:szCs w:val="28"/>
+      </w:r>
+      <w:r>
+        <w:rPr>
+          <w:rFonts w:ascii="Times New Roman" w:hAnsi="Times New Roman" w:cs="Times New Roman"/>
+        </w:rPr>
+        <w:t xml:space="preserve">With the partial demo, which lacked a </w:t>
+      </w:r>
+      <w:r>
+        <w:rPr>
+          <w:rFonts w:ascii="Times New Roman" w:hAnsi="Times New Roman" w:cs="Times New Roman"/>
+        </w:rPr>
+        <w:t xml:space="preserve">proper progression system, I asked a group of 4 to try the game, and gave each the base build along with an experimental build that would test a </w:t>
+      </w:r>
+      <w:r>
+        <w:rPr>
+          <w:rFonts w:ascii="Times New Roman" w:hAnsi="Times New Roman" w:cs="Times New Roman"/>
+        </w:rPr>
+        <w:t xml:space="preserve">couple </w:t>
+      </w:r>
+      <w:r>
+        <w:rPr>
+          <w:rFonts w:ascii="Times New Roman" w:hAnsi="Times New Roman" w:cs="Times New Roman"/>
+        </w:rPr>
+        <w:t>new feature</w:t>
+      </w:r>
+      <w:r>
+        <w:rPr>
+          <w:rFonts w:ascii="Times New Roman" w:hAnsi="Times New Roman" w:cs="Times New Roman"/>
+        </w:rPr>
+        <w:t>s</w:t>
+      </w:r>
+      <w:r>
+        <w:rPr>
+          <w:rFonts w:ascii="Times New Roman" w:hAnsi="Times New Roman" w:cs="Times New Roman"/>
+        </w:rPr>
+        <w:t xml:space="preserve">. These features included </w:t>
+      </w:r>
+      <w:r>
+        <w:rPr>
+          <w:rFonts w:ascii="Times New Roman" w:hAnsi="Times New Roman" w:cs="Times New Roman"/>
+        </w:rPr>
+        <w:t xml:space="preserve">having the water button prompt a sound queue when active, playing a sound whenever the </w:t>
+      </w:r>
+      <w:r>
+        <w:rPr>
+          <w:rFonts w:ascii="Times New Roman" w:hAnsi="Times New Roman" w:cs="Times New Roman"/>
+        </w:rPr>
+        <w:t xml:space="preserve">plant was finished, and having the water button turn inactive again if not used within a set timeframe. I then asked for anecdotes about their experience, making sure to highlight whether they found the game too distracting when performing other tasks on their computer. </w:t>
+      </w:r>
+    </w:p>
+    <w:p>
+      <w:pPr>
+        <w:ind w:firstLine="720"/>
+        <w:rPr>
+          <w:rFonts w:ascii="Times New Roman" w:hAnsi="Times New Roman" w:cs="Times New Roman"/>
+        </w:rPr>
+      </w:pPr>
+      <w:r>
+        <w:rPr>
+          <w:rFonts w:ascii="Times New Roman" w:hAnsi="Times New Roman" w:cs="Times New Roman"/>
+        </w:rPr>
+        <w:t>The responses I got were fairly universal, which I figured was a good sign. The game did not seem too distracting to any of them and they were able to work while it was running without significant issue. The issues came with the experimental features. Sound queues seemed to make the game more distracting, and that would</w:t>
+      </w:r>
+      <w:r>
+        <w:rPr>
+          <w:rFonts w:ascii="Times New Roman" w:hAnsi="Times New Roman" w:cs="Times New Roman"/>
+        </w:rPr>
+        <w:t xml:space="preserve"> ignore the fact that I did not have my own sound assets at the time, and would ideally want to make them myself. To worsen the issue, </w:t>
+      </w:r>
+      <w:r>
+        <w:rPr>
+          <w:rFonts w:ascii="Times New Roman" w:hAnsi="Times New Roman" w:cs="Times New Roman"/>
+        </w:rPr>
+        <w:t xml:space="preserve">making the water button disappear to punish idle play </w:t>
+      </w:r>
+      <w:r>
+        <w:rPr>
+          <w:rFonts w:ascii="Times New Roman" w:hAnsi="Times New Roman" w:cs="Times New Roman"/>
+        </w:rPr>
+        <w:t>proved</w:t>
+      </w:r>
+      <w:r>
+        <w:rPr>
+          <w:rFonts w:ascii="Times New Roman" w:hAnsi="Times New Roman" w:cs="Times New Roman"/>
+        </w:rPr>
+        <w:t xml:space="preserve"> to be too stressful, as many of them thought it necessitated checking the window often to make sure it would not vanish. Most of these</w:t>
+      </w:r>
+      <w:r>
+        <w:rPr>
+          <w:rFonts w:ascii="Times New Roman" w:hAnsi="Times New Roman" w:cs="Times New Roman"/>
+        </w:rPr>
+        <w:t xml:space="preserve"> experimental features, while convenient for game progression, damaged the intended purpose of the game, which is a side activity while you perform other tasks, so I abandoned all of them. Though in retrospect, making them toggleable as opposed to removing them may have been ideal. I could have provided the player with options instead of salting my own fields, as all this really results in is my game having no features to show for the work I put into implementing those experiments. Shows to not be dramatic, I suppose!</w:t>
+      </w:r>
+    </w:p>
+    <w:p>
+      <w:pPr>
+        <w:ind w:firstLine="720"/>
+        <w:rPr>
+          <w:rFonts w:ascii="Times New Roman" w:hAnsi="Times New Roman" w:cs="Times New Roman"/>
+        </w:rPr>
+      </w:pPr>
+      <w:r>
+        <w:rPr>
+          <w:rFonts w:ascii="Times New Roman" w:hAnsi="Times New Roman" w:cs="Times New Roman"/>
+        </w:rPr>
+        <w:t xml:space="preserve">Regardless, the consensus seemed to be that my game succeeded in not being too intrusive, but I got few comments on whether idle play was discouraged, primarily because my testers had not played corner games before and as such had no </w:t>
+      </w:r>
+      <w:r>
+        <w:rPr>
+          <w:rFonts w:ascii="Times New Roman" w:hAnsi="Times New Roman" w:cs="Times New Roman"/>
+        </w:rPr>
+        <w:t>basis</w:t>
+      </w:r>
+      <w:r>
+        <w:rPr>
+          <w:rFonts w:ascii="Times New Roman" w:hAnsi="Times New Roman" w:cs="Times New Roman"/>
+        </w:rPr>
+        <w:t xml:space="preserve"> for comparison. In retrospect, I should have bought each of them a copy of a different corner game and had them test that so they could compare, but it’s a tad bit late for that idea. </w:t>
+      </w:r>
+      <w:r>
+        <w:rPr>
+          <w:rFonts w:ascii="Times New Roman" w:hAnsi="Times New Roman" w:cs="Times New Roman"/>
+        </w:rPr>
+        <w:t>I suppose there’s always next time!</w:t>
+      </w:r>
+    </w:p>
+    <w:p>
+      <w:pPr>
+        <w:ind w:firstLine="720"/>
+        <w:rPr>
+          <w:rFonts w:ascii="Times New Roman" w:hAnsi="Times New Roman" w:cs="Times New Roman"/>
+        </w:rPr>
+      </w:pPr>
+      <w:r>
+        <w:rPr>
+          <w:rFonts w:ascii="Times New Roman" w:hAnsi="Times New Roman" w:cs="Times New Roman"/>
+        </w:rPr>
+        <w:t xml:space="preserve">While that form of testing was helpful for getting outside insight, most of my testing was feature testing </w:t>
+      </w:r>
+      <w:r>
+        <w:rPr>
+          <w:rFonts w:ascii="Times New Roman" w:hAnsi="Times New Roman" w:cs="Times New Roman"/>
+        </w:rPr>
+        <w:t>done by</w:t>
+      </w:r>
+      <w:r>
+        <w:rPr>
+          <w:rFonts w:ascii="Times New Roman" w:hAnsi="Times New Roman" w:cs="Times New Roman"/>
+        </w:rPr>
+        <w:t xml:space="preserve"> myself using a test build of the game.</w:t>
+      </w:r>
+      <w:r>
+        <w:rPr>
+          <w:rFonts w:ascii="Times New Roman" w:hAnsi="Times New Roman" w:cs="Times New Roman"/>
+        </w:rPr>
+        <w:t xml:space="preserve"> Throughout programming I would intentionally stress test everything I implemented to make sure it ran smoothly. Thankfully, a 2D idle game is unlikely to </w:t>
+      </w:r>
+      <w:r>
+        <w:rPr>
+          <w:rFonts w:ascii="Times New Roman" w:hAnsi="Times New Roman" w:cs="Times New Roman"/>
+        </w:rPr>
+        <w:t>produce random physics bugs since objects are not interacting, but I was surprised at how many issues could spring up just from having objects communicate with each other.</w:t>
+      </w:r>
+      <w:r>
+        <w:rPr>
+          <w:rFonts w:ascii="Times New Roman" w:hAnsi="Times New Roman" w:cs="Times New Roman"/>
+        </w:rPr>
+        <w:t xml:space="preserve"> Implementing saves alone added a day’s worth of work to ensure that data was not being overwritten, and it still has a couple of known issues.</w:t>
+      </w:r>
+      <w:r>
+        <w:rPr>
+          <w:rFonts w:ascii="Times New Roman" w:hAnsi="Times New Roman" w:cs="Times New Roman"/>
+        </w:rPr>
+        <w:t xml:space="preserve"> Testing was not isolated, it was a constant practice as I was implementing the game.</w:t>
+      </w:r>
+    </w:p>
+    <w:p>
+      <w:pPr>
+        <w:ind w:firstLine="720"/>
+        <w:rPr>
+          <w:rFonts w:ascii="Times New Roman" w:hAnsi="Times New Roman" w:cs="Times New Roman"/>
+        </w:rPr>
+      </w:pPr>
+      <w:r>
+        <w:rPr>
+          <w:rFonts w:ascii="Times New Roman" w:hAnsi="Times New Roman" w:cs="Times New Roman"/>
+        </w:rPr>
+        <w:t xml:space="preserve">This constant testing cycle ensured that nothing felt incomplete. Every time I added a new feature, object, or sprite, I would test and make sure it fit my requirements. Does the sprite fit in the window? Does the button do what it’s supposed to? Does the data save properly when </w:t>
+      </w:r>
+      <w:r>
+        <w:rPr>
+          <w:rFonts w:ascii="Times New Roman" w:hAnsi="Times New Roman" w:cs="Times New Roman"/>
+        </w:rPr>
+        <w:lastRenderedPageBreak/>
+        <w:t xml:space="preserve">exiting? Testing would usually involve a back and forth of asking questions, finding they didn’t work, and then running several runs until I found the solution after repeated trials. Unity’s editor log was my best friend during this, though I admit having the only developer do most of the playtesting is flawed. Most game studios will have dedicated </w:t>
+      </w:r>
+      <w:r>
+        <w:rPr>
+          <w:rFonts w:ascii="Times New Roman" w:hAnsi="Times New Roman" w:cs="Times New Roman"/>
+        </w:rPr>
+        <w:t>play testers</w:t>
+      </w:r>
+      <w:r>
+        <w:rPr>
+          <w:rFonts w:ascii="Times New Roman" w:hAnsi="Times New Roman" w:cs="Times New Roman"/>
+        </w:rPr>
+        <w:t xml:space="preserve"> since developers are likely going to anticipate certain issues and search for them, but cannot always predict the unpredictable.</w:t>
+      </w:r>
+      <w:r>
+        <w:rPr>
+          <w:rFonts w:ascii="Times New Roman" w:hAnsi="Times New Roman" w:cs="Times New Roman"/>
+        </w:rPr>
+        <w:t xml:space="preserve"> There could be issues I don’t know about, and I’d have to rely on users contacting me to fix them.</w:t>
+      </w:r>
+    </w:p>
+    <w:p>
+      <w:pPr>
+        <w:ind w:firstLine="720"/>
+        <w:rPr>
+          <w:rFonts w:ascii="Times New Roman" w:hAnsi="Times New Roman" w:cs="Times New Roman"/>
+        </w:rPr>
+      </w:pPr>
+    </w:p>
+    <w:p>
+      <w:pPr>
+        <w:rPr>
+          <w:rFonts w:ascii="Times New Roman" w:hAnsi="Times New Roman" w:cs="Times New Roman"/>
+        </w:rPr>
+      </w:pPr>
+    </w:p>
+    <w:p>
+      <w:pPr>
+        <w:rPr>
+          <w:rFonts w:ascii="Times New Roman" w:hAnsi="Times New Roman" w:cs="Times New Roman"/>
+        </w:rPr>
+      </w:pPr>
+    </w:p>
+    <w:p>
+      <w:pPr>
+        <w:rPr>
+          <w:rFonts w:ascii="Times New Roman" w:hAnsi="Times New Roman" w:cs="Times New Roman"/>
+        </w:rPr>
+      </w:pPr>
+    </w:p>
+    <w:p>
+      <w:pPr>
+        <w:rPr>
+          <w:rFonts w:ascii="Times New Roman" w:hAnsi="Times New Roman" w:cs="Times New Roman"/>
+        </w:rPr>
+      </w:pPr>
+    </w:p>
+    <w:p>
+      <w:pPr>
+        <w:rPr>
+          <w:rFonts w:ascii="Times New Roman" w:hAnsi="Times New Roman" w:cs="Times New Roman"/>
+        </w:rPr>
+      </w:pPr>
+    </w:p>
+    <w:p>
+      <w:pPr>
+        <w:rPr>
+          <w:rFonts w:ascii="Times New Roman" w:hAnsi="Times New Roman" w:cs="Times New Roman"/>
+        </w:rPr>
+      </w:pPr>
+    </w:p>
+    <w:p>
+      <w:pPr>
+        <w:rPr>
+          <w:rFonts w:ascii="Times New Roman" w:hAnsi="Times New Roman" w:cs="Times New Roman"/>
+        </w:rPr>
+      </w:pPr>
+    </w:p>
+    <w:p>
+      <w:pPr>
+        <w:rPr>
+          <w:rFonts w:ascii="Times New Roman" w:hAnsi="Times New Roman" w:cs="Times New Roman"/>
+        </w:rPr>
+      </w:pPr>
+    </w:p>
+    <w:p>
+      <w:pPr>
+        <w:rPr>
+          <w:rFonts w:ascii="Times New Roman" w:hAnsi="Times New Roman" w:cs="Times New Roman"/>
+        </w:rPr>
+      </w:pPr>
+    </w:p>
+    <w:p>
+      <w:pPr>
+        <w:rPr>
+          <w:rFonts w:ascii="Times New Roman" w:hAnsi="Times New Roman" w:cs="Times New Roman"/>
+        </w:rPr>
+      </w:pPr>
+    </w:p>
+    <w:p>
+      <w:pPr>
+        <w:rPr>
+          <w:rFonts w:ascii="Times New Roman" w:hAnsi="Times New Roman" w:cs="Times New Roman"/>
+        </w:rPr>
+      </w:pPr>
+    </w:p>
+    <w:p>
+      <w:pPr>
+        <w:rPr>
+          <w:rFonts w:ascii="Times New Roman" w:hAnsi="Times New Roman" w:cs="Times New Roman"/>
+        </w:rPr>
+      </w:pPr>
+    </w:p>
+    <w:p>
+      <w:pPr>
+        <w:rPr>
+          <w:rFonts w:ascii="Times New Roman" w:hAnsi="Times New Roman" w:cs="Times New Roman"/>
+        </w:rPr>
+      </w:pPr>
+    </w:p>
+    <w:p>
+      <w:pPr>
+        <w:rPr>
+          <w:rFonts w:ascii="Times New Roman" w:hAnsi="Times New Roman" w:cs="Times New Roman"/>
+        </w:rPr>
+      </w:pPr>
+    </w:p>
+    <w:p>
+      <w:pPr>
+        <w:rPr>
+          <w:rFonts w:ascii="Times New Roman" w:hAnsi="Times New Roman" w:cs="Times New Roman"/>
+        </w:rPr>
+      </w:pPr>
+    </w:p>
+    <w:p>
+      <w:pPr>
+        <w:rPr>
+          <w:rFonts w:ascii="Times New Roman" w:hAnsi="Times New Roman" w:cs="Times New Roman"/>
+        </w:rPr>
+      </w:pPr>
+    </w:p>
+    <w:p>
+      <w:pPr>
+        <w:rPr>
+          <w:rFonts w:ascii="Times New Roman" w:hAnsi="Times New Roman" w:cs="Times New Roman"/>
+        </w:rPr>
+      </w:pPr>
+    </w:p>
+    <w:p>
+      <w:pPr>
+        <w:rPr>
+          <w:rFonts w:ascii="Times New Roman" w:hAnsi="Times New Roman" w:cs="Times New Roman"/>
+        </w:rPr>
+      </w:pPr>
+    </w:p>
+    <w:p>
+      <w:pPr>
+        <w:rPr>
+          <w:rFonts w:ascii="Times New Roman" w:hAnsi="Times New Roman" w:cs="Times New Roman"/>
+        </w:rPr>
+      </w:pPr>
+    </w:p>
+    <w:p>
+      <w:pPr>
+        <w:rPr>
+          <w:rFonts w:ascii="Times New Roman" w:hAnsi="Times New Roman" w:cs="Times New Roman"/>
+        </w:rPr>
+      </w:pPr>
+    </w:p>
+    <w:p>
+      <w:pPr>
+        <w:rPr>
+          <w:rFonts w:ascii="Times New Roman" w:hAnsi="Times New Roman" w:cs="Times New Roman"/>
+        </w:rPr>
+      </w:pPr>
+    </w:p>
+    <w:p>
+      <w:pPr>
+        <w:rPr>
+          <w:rFonts w:ascii="Times New Roman" w:hAnsi="Times New Roman" w:cs="Times New Roman"/>
+        </w:rPr>
+      </w:pPr>
+    </w:p>
+    <w:p>
+      <w:pPr>
+        <w:rPr>
+          <w:rFonts w:ascii="Times New Roman" w:hAnsi="Times New Roman" w:cs="Times New Roman"/>
+        </w:rPr>
+      </w:pPr>
+    </w:p>
+    <w:p>
+      <w:pPr>
+        <w:rPr>
+          <w:rFonts w:ascii="Times New Roman" w:hAnsi="Times New Roman" w:cs="Times New Roman"/>
         </w:rPr>
       </w:pPr>
       <w:r>
@@ -2125,7 +3518,7 @@
           <w:sz w:val="28"/>
           <w:szCs w:val="28"/>
         </w:rPr>
-        <w:t>Future Improvement</w:t>
+        <w:t>Outcomes</w:t>
       </w:r>
     </w:p>
     <w:p>
@@ -2139,23 +3532,179 @@
           <w:rFonts w:ascii="Times New Roman" w:hAnsi="Times New Roman" w:cs="Times New Roman"/>
         </w:rPr>
         <w:tab/>
-        <w:t>What can be done from here on</w:t>
-      </w:r>
-      <w:r>
-        <w:rPr>
-          <w:rFonts w:ascii="Times New Roman" w:hAnsi="Times New Roman" w:cs="Times New Roman"/>
-        </w:rPr>
-        <w:t>? Particularly, if I wanted to sell this on Steam or another online marketplace, what would I want to do first? Which stretch goals did I have that I did not accomplish?</w:t>
-      </w:r>
-      <w:r>
-        <w:rPr>
-          <w:rFonts w:ascii="Times New Roman" w:hAnsi="Times New Roman" w:cs="Times New Roman"/>
-        </w:rPr>
-        <w:t xml:space="preserve"> Am I missing anything I once considered essential? Essentially, how can this be built upon to be a “complete” game?</w:t>
-      </w:r>
-    </w:p>
-    <w:p>
-      <w:pPr>
+        <w:t>What resulted from testing? What was done to change the final design after the demo? Was it informed by player feedback or by my own desires? This part may turn into a subsection, with this section being more focused on the design cycle. I essentially went through the pipeline again after testing, in order to incorporate feedback and my desired improvements.</w:t>
+      </w:r>
+    </w:p>
+    <w:p>
+      <w:pPr>
+        <w:rPr>
+          <w:rFonts w:ascii="Times New Roman" w:hAnsi="Times New Roman" w:cs="Times New Roman"/>
+        </w:rPr>
+      </w:pPr>
+    </w:p>
+    <w:p>
+      <w:pPr>
+        <w:rPr>
+          <w:rFonts w:ascii="Times New Roman" w:hAnsi="Times New Roman" w:cs="Times New Roman"/>
+        </w:rPr>
+      </w:pPr>
+    </w:p>
+    <w:p>
+      <w:pPr>
+        <w:rPr>
+          <w:rFonts w:ascii="Times New Roman" w:hAnsi="Times New Roman" w:cs="Times New Roman"/>
+        </w:rPr>
+      </w:pPr>
+    </w:p>
+    <w:p>
+      <w:pPr>
+        <w:rPr>
+          <w:rFonts w:ascii="Times New Roman" w:hAnsi="Times New Roman" w:cs="Times New Roman"/>
+        </w:rPr>
+      </w:pPr>
+    </w:p>
+    <w:p>
+      <w:pPr>
+        <w:rPr>
+          <w:rFonts w:ascii="Times New Roman" w:hAnsi="Times New Roman" w:cs="Times New Roman"/>
+        </w:rPr>
+      </w:pPr>
+    </w:p>
+    <w:p>
+      <w:pPr>
+        <w:rPr>
+          <w:rFonts w:ascii="Times New Roman" w:hAnsi="Times New Roman" w:cs="Times New Roman"/>
+        </w:rPr>
+      </w:pPr>
+    </w:p>
+    <w:p>
+      <w:pPr>
+        <w:rPr>
+          <w:rFonts w:ascii="Times New Roman" w:hAnsi="Times New Roman" w:cs="Times New Roman"/>
+        </w:rPr>
+      </w:pPr>
+    </w:p>
+    <w:p>
+      <w:pPr>
+        <w:rPr>
+          <w:rFonts w:ascii="Times New Roman" w:hAnsi="Times New Roman" w:cs="Times New Roman"/>
+        </w:rPr>
+      </w:pPr>
+    </w:p>
+    <w:p>
+      <w:pPr>
+        <w:rPr>
+          <w:rFonts w:ascii="Times New Roman" w:hAnsi="Times New Roman" w:cs="Times New Roman"/>
+        </w:rPr>
+      </w:pPr>
+    </w:p>
+    <w:p>
+      <w:pPr>
+        <w:rPr>
+          <w:rFonts w:ascii="Times New Roman" w:hAnsi="Times New Roman" w:cs="Times New Roman"/>
+        </w:rPr>
+      </w:pPr>
+    </w:p>
+    <w:p>
+      <w:pPr>
+        <w:rPr>
+          <w:rFonts w:ascii="Times New Roman" w:hAnsi="Times New Roman" w:cs="Times New Roman"/>
+        </w:rPr>
+      </w:pPr>
+    </w:p>
+    <w:p>
+      <w:pPr>
+        <w:rPr>
+          <w:rFonts w:ascii="Times New Roman" w:hAnsi="Times New Roman" w:cs="Times New Roman"/>
+        </w:rPr>
+      </w:pPr>
+    </w:p>
+    <w:p>
+      <w:pPr>
+        <w:rPr>
+          <w:rFonts w:ascii="Times New Roman" w:hAnsi="Times New Roman" w:cs="Times New Roman"/>
+        </w:rPr>
+      </w:pPr>
+    </w:p>
+    <w:p>
+      <w:pPr>
+        <w:rPr>
+          <w:rFonts w:ascii="Times New Roman" w:hAnsi="Times New Roman" w:cs="Times New Roman"/>
+        </w:rPr>
+      </w:pPr>
+    </w:p>
+    <w:p>
+      <w:pPr>
+        <w:rPr>
+          <w:rFonts w:ascii="Times New Roman" w:hAnsi="Times New Roman" w:cs="Times New Roman"/>
+        </w:rPr>
+      </w:pPr>
+    </w:p>
+    <w:p>
+      <w:pPr>
+        <w:rPr>
+          <w:rFonts w:ascii="Times New Roman" w:hAnsi="Times New Roman" w:cs="Times New Roman"/>
+        </w:rPr>
+      </w:pPr>
+    </w:p>
+    <w:p>
+      <w:pPr>
+        <w:rPr>
+          <w:rFonts w:ascii="Times New Roman" w:hAnsi="Times New Roman" w:cs="Times New Roman"/>
+        </w:rPr>
+      </w:pPr>
+    </w:p>
+    <w:p>
+      <w:pPr>
+        <w:rPr>
+          <w:rFonts w:ascii="Times New Roman" w:hAnsi="Times New Roman" w:cs="Times New Roman"/>
+        </w:rPr>
+      </w:pPr>
+    </w:p>
+    <w:p>
+      <w:pPr>
+        <w:rPr>
+          <w:rFonts w:ascii="Times New Roman" w:hAnsi="Times New Roman" w:cs="Times New Roman"/>
+        </w:rPr>
+      </w:pPr>
+    </w:p>
+    <w:p>
+      <w:pPr>
+        <w:rPr>
+          <w:rFonts w:ascii="Times New Roman" w:hAnsi="Times New Roman" w:cs="Times New Roman"/>
+        </w:rPr>
+      </w:pPr>
+    </w:p>
+    <w:p>
+      <w:pPr>
+        <w:rPr>
+          <w:rFonts w:ascii="Times New Roman" w:hAnsi="Times New Roman" w:cs="Times New Roman"/>
+        </w:rPr>
+      </w:pPr>
+    </w:p>
+    <w:p>
+      <w:pPr>
+        <w:rPr>
+          <w:rFonts w:ascii="Times New Roman" w:hAnsi="Times New Roman" w:cs="Times New Roman"/>
+        </w:rPr>
+      </w:pPr>
+    </w:p>
+    <w:p>
+      <w:pPr>
+        <w:rPr>
+          <w:rFonts w:ascii="Times New Roman" w:hAnsi="Times New Roman" w:cs="Times New Roman"/>
+        </w:rPr>
+      </w:pPr>
+    </w:p>
+    <w:p>
+      <w:pPr>
+        <w:rPr>
+          <w:rFonts w:ascii="Times New Roman" w:hAnsi="Times New Roman" w:cs="Times New Roman"/>
+          <w:sz w:val="28"/>
+          <w:szCs w:val="28"/>
+        </w:rPr>
+      </w:pPr>
+      <w:r>
         <w:rPr>
           <w:rFonts w:ascii="Times New Roman" w:hAnsi="Times New Roman" w:cs="Times New Roman"/>
           <w:b/>
@@ -2163,8 +3712,791 @@
           <w:sz w:val="28"/>
           <w:szCs w:val="28"/>
         </w:rPr>
-      </w:pPr>
-      <w:r>
+        <w:t>Future Improvement</w:t>
+      </w:r>
+    </w:p>
+    <w:p>
+      <w:pPr>
+        <w:rPr>
+          <w:rFonts w:ascii="Times New Roman" w:hAnsi="Times New Roman" w:cs="Times New Roman"/>
+        </w:rPr>
+      </w:pPr>
+      <w:r>
+        <w:rPr>
+          <w:rFonts w:ascii="Times New Roman" w:hAnsi="Times New Roman" w:cs="Times New Roman"/>
+        </w:rPr>
+        <w:tab/>
+      </w:r>
+      <w:r>
+        <w:rPr>
+          <w:rFonts w:ascii="Times New Roman" w:hAnsi="Times New Roman" w:cs="Times New Roman"/>
+        </w:rPr>
+        <w:t>The catch with game development is that “doneness”</w:t>
+      </w:r>
+      <w:r>
+        <w:rPr>
+          <w:rFonts w:ascii="Times New Roman" w:hAnsi="Times New Roman" w:cs="Times New Roman"/>
+        </w:rPr>
+        <w:t xml:space="preserve"> is often difficult to measure. Games are often updated after their launch with new features</w:t>
+      </w:r>
+      <w:r>
+        <w:rPr>
+          <w:rFonts w:ascii="Times New Roman" w:hAnsi="Times New Roman" w:cs="Times New Roman"/>
+        </w:rPr>
+        <w:t xml:space="preserve"> developers wanted to include, but couldn’t due to time and budget restraints, as well as a myriad of other external and internal factors.</w:t>
+      </w:r>
+      <w:r>
+        <w:rPr>
+          <w:rFonts w:ascii="Times New Roman" w:hAnsi="Times New Roman" w:cs="Times New Roman"/>
+        </w:rPr>
+        <w:t xml:space="preserve"> A game can feel “done” at several points in development, but like most art forms, it always feels as if you could add more.</w:t>
+      </w:r>
+      <w:r>
+        <w:rPr>
+          <w:rFonts w:ascii="Times New Roman" w:hAnsi="Times New Roman" w:cs="Times New Roman"/>
+        </w:rPr>
+        <w:t xml:space="preserve"> Furthermore, while some ideas </w:t>
+      </w:r>
+      <w:r>
+        <w:rPr>
+          <w:rFonts w:ascii="Times New Roman" w:hAnsi="Times New Roman" w:cs="Times New Roman"/>
+        </w:rPr>
+        <w:t xml:space="preserve">feel more essential, some are simply to make the game feel more polished. </w:t>
+      </w:r>
+    </w:p>
+    <w:p>
+      <w:pPr>
+        <w:ind w:firstLine="720"/>
+        <w:rPr>
+          <w:rFonts w:ascii="Times New Roman" w:hAnsi="Times New Roman" w:cs="Times New Roman"/>
+        </w:rPr>
+      </w:pPr>
+      <w:r>
+        <w:rPr>
+          <w:rFonts w:ascii="Times New Roman" w:hAnsi="Times New Roman" w:cs="Times New Roman"/>
+        </w:rPr>
+        <w:t>Drawing a line and saying the game is done at a certain point is difficult, but</w:t>
+      </w:r>
+      <w:r>
+        <w:rPr>
+          <w:rFonts w:ascii="Times New Roman" w:hAnsi="Times New Roman" w:cs="Times New Roman"/>
+        </w:rPr>
+        <w:t xml:space="preserve"> </w:t>
+      </w:r>
+      <w:r>
+        <w:rPr>
+          <w:rFonts w:ascii="Times New Roman" w:hAnsi="Times New Roman" w:cs="Times New Roman"/>
+        </w:rPr>
+        <w:t xml:space="preserve">I can use the games I mentioned in the Background as a reference point for what a finished corner game looks like. </w:t>
+      </w:r>
+      <w:r>
+        <w:rPr>
+          <w:rFonts w:ascii="Times New Roman" w:hAnsi="Times New Roman" w:cs="Times New Roman"/>
+        </w:rPr>
+        <w:t xml:space="preserve">So I’m deciding to separate future improvements into functional and non-functional components. Functional </w:t>
+      </w:r>
+      <w:r>
+        <w:rPr>
+          <w:rFonts w:ascii="Times New Roman" w:hAnsi="Times New Roman" w:cs="Times New Roman"/>
+        </w:rPr>
+        <w:t>features</w:t>
+      </w:r>
+      <w:r>
+        <w:rPr>
+          <w:rFonts w:ascii="Times New Roman" w:hAnsi="Times New Roman" w:cs="Times New Roman"/>
+        </w:rPr>
+        <w:t xml:space="preserve"> are what I believe would be essential if I were to sell this game commercially on a platform like Steam. </w:t>
+      </w:r>
+      <w:r>
+        <w:rPr>
+          <w:rFonts w:ascii="Times New Roman" w:hAnsi="Times New Roman" w:cs="Times New Roman"/>
+        </w:rPr>
+        <w:t xml:space="preserve">Most of these will be derived from the competition, and will be essential features that I think the game needs to fulfill its purpose at a commercial level, rather than fulfill its purpose as a capstone project. </w:t>
+      </w:r>
+      <w:r>
+        <w:rPr>
+          <w:rFonts w:ascii="Times New Roman" w:hAnsi="Times New Roman" w:cs="Times New Roman"/>
+        </w:rPr>
+        <w:t>These features would be necessary for a “1.0” release of the game, should I ever decide to market it.</w:t>
+      </w:r>
+      <w:r>
+        <w:rPr>
+          <w:rFonts w:ascii="Times New Roman" w:hAnsi="Times New Roman" w:cs="Times New Roman"/>
+        </w:rPr>
+        <w:t xml:space="preserve"> The non-functional features would be ones that I’d personally like to add, but don’t contribute much to the function of the game. Think of them as the polish</w:t>
+      </w:r>
+      <w:r>
+        <w:rPr>
+          <w:rFonts w:ascii="Times New Roman" w:hAnsi="Times New Roman" w:cs="Times New Roman"/>
+        </w:rPr>
+        <w:t xml:space="preserve"> to a finished work, the icing on our metaphorical cake.</w:t>
+      </w:r>
+    </w:p>
+    <w:p>
+      <w:pPr>
+        <w:rPr>
+          <w:rFonts w:ascii="Times New Roman" w:hAnsi="Times New Roman" w:cs="Times New Roman"/>
+          <w:b/>
+          <w:bCs/>
+        </w:rPr>
+      </w:pPr>
+      <w:r>
+        <w:rPr>
+          <w:rFonts w:ascii="Times New Roman" w:hAnsi="Times New Roman" w:cs="Times New Roman"/>
+          <w:b/>
+          <w:bCs/>
+        </w:rPr>
+        <w:t>Functional Features</w:t>
+      </w:r>
+    </w:p>
+    <w:p>
+      <w:pPr>
+        <w:rPr>
+          <w:rFonts w:ascii="Times New Roman" w:hAnsi="Times New Roman" w:cs="Times New Roman"/>
+        </w:rPr>
+      </w:pPr>
+      <w:r>
+        <w:rPr>
+          <w:rFonts w:ascii="Times New Roman" w:hAnsi="Times New Roman" w:cs="Times New Roman"/>
+          <w:b/>
+          <w:bCs/>
+        </w:rPr>
+        <w:tab/>
+      </w:r>
+      <w:r>
+        <w:rPr>
+          <w:rFonts w:ascii="Times New Roman" w:hAnsi="Times New Roman" w:cs="Times New Roman"/>
+        </w:rPr>
+        <w:t xml:space="preserve">The most obvious requirement for a game like this would be additional accessibility settings. It was a pain in the </w:t>
+      </w:r>
+      <w:r>
+        <w:rPr>
+          <w:rFonts w:ascii="Times New Roman" w:hAnsi="Times New Roman" w:cs="Times New Roman"/>
+        </w:rPr>
+        <w:t>neck</w:t>
+      </w:r>
+      <w:r>
+        <w:rPr>
+          <w:rFonts w:ascii="Times New Roman" w:hAnsi="Times New Roman" w:cs="Times New Roman"/>
+        </w:rPr>
+        <w:t xml:space="preserve"> just configur</w:t>
+      </w:r>
+      <w:r>
+        <w:rPr>
+          <w:rFonts w:ascii="Times New Roman" w:hAnsi="Times New Roman" w:cs="Times New Roman"/>
+        </w:rPr>
+        <w:t>ing</w:t>
+      </w:r>
+      <w:r>
+        <w:rPr>
+          <w:rFonts w:ascii="Times New Roman" w:hAnsi="Times New Roman" w:cs="Times New Roman"/>
+        </w:rPr>
+        <w:t xml:space="preserve"> the window </w:t>
+      </w:r>
+      <w:r>
+        <w:rPr>
+          <w:rFonts w:ascii="Times New Roman" w:hAnsi="Times New Roman" w:cs="Times New Roman"/>
+        </w:rPr>
+        <w:t xml:space="preserve">to look </w:t>
+      </w:r>
+      <w:r>
+        <w:rPr>
+          <w:rFonts w:ascii="Times New Roman" w:hAnsi="Times New Roman" w:cs="Times New Roman"/>
+        </w:rPr>
+        <w:t xml:space="preserve">as it </w:t>
+      </w:r>
+      <w:r>
+        <w:rPr>
+          <w:rFonts w:ascii="Times New Roman" w:hAnsi="Times New Roman" w:cs="Times New Roman"/>
+        </w:rPr>
+        <w:t>does now</w:t>
+      </w:r>
+      <w:r>
+        <w:rPr>
+          <w:rFonts w:ascii="Times New Roman" w:hAnsi="Times New Roman" w:cs="Times New Roman"/>
+        </w:rPr>
+        <w:t xml:space="preserve">, but what if a person wants to see their word count on a Microsoft Word document? As it is </w:t>
+      </w:r>
+      <w:r>
+        <w:rPr>
+          <w:rFonts w:ascii="Times New Roman" w:hAnsi="Times New Roman" w:cs="Times New Roman"/>
+        </w:rPr>
+        <w:t xml:space="preserve">right </w:t>
+      </w:r>
+      <w:r>
+        <w:rPr>
+          <w:rFonts w:ascii="Times New Roman" w:hAnsi="Times New Roman" w:cs="Times New Roman"/>
+        </w:rPr>
+        <w:t>now, the game’s window blocks this.</w:t>
+      </w:r>
+      <w:r>
+        <w:rPr>
+          <w:rFonts w:ascii="Times New Roman" w:hAnsi="Times New Roman" w:cs="Times New Roman"/>
+        </w:rPr>
+        <w:t xml:space="preserve"> Allowing users to adjust the size and position of the window is a common feature in corner </w:t>
+      </w:r>
+      <w:r>
+        <w:rPr>
+          <w:rFonts w:ascii="Times New Roman" w:hAnsi="Times New Roman" w:cs="Times New Roman"/>
+        </w:rPr>
+        <w:t>games and</w:t>
+      </w:r>
+      <w:r>
+        <w:rPr>
+          <w:rFonts w:ascii="Times New Roman" w:hAnsi="Times New Roman" w:cs="Times New Roman"/>
+        </w:rPr>
+        <w:t xml:space="preserve"> would be a necessary step for a commercial release of Cornursery. </w:t>
+      </w:r>
+    </w:p>
+    <w:p>
+      <w:pPr>
+        <w:rPr>
+          <w:rFonts w:ascii="Times New Roman" w:hAnsi="Times New Roman" w:cs="Times New Roman"/>
+        </w:rPr>
+      </w:pPr>
+      <w:r>
+        <w:rPr>
+          <w:rFonts w:ascii="Times New Roman" w:hAnsi="Times New Roman" w:cs="Times New Roman"/>
+        </w:rPr>
+        <w:tab/>
+        <w:t>More customization in general would be ideal for the game, some players may want sound queues when a task is available, while others may want them off, or for them to be toggleable.</w:t>
+      </w:r>
+      <w:r>
+        <w:rPr>
+          <w:rFonts w:ascii="Times New Roman" w:hAnsi="Times New Roman" w:cs="Times New Roman"/>
+        </w:rPr>
+        <w:t xml:space="preserve"> I chose whatever option resonated with my testers most, but my small pool of 4 cannot account for the entire demographic my game may appeal to.</w:t>
+      </w:r>
+      <w:r>
+        <w:rPr>
+          <w:rFonts w:ascii="Times New Roman" w:hAnsi="Times New Roman" w:cs="Times New Roman"/>
+        </w:rPr>
+        <w:t xml:space="preserve"> Customization options would allow for a wider range of playable characters to be satisfied with the game</w:t>
+      </w:r>
+      <w:r>
+        <w:rPr>
+          <w:rFonts w:ascii="Times New Roman" w:hAnsi="Times New Roman" w:cs="Times New Roman"/>
+        </w:rPr>
+        <w:t>.</w:t>
+      </w:r>
+    </w:p>
+    <w:p>
+      <w:pPr>
+        <w:rPr>
+          <w:rFonts w:ascii="Times New Roman" w:hAnsi="Times New Roman" w:cs="Times New Roman"/>
+        </w:rPr>
+      </w:pPr>
+      <w:r>
+        <w:rPr>
+          <w:rFonts w:ascii="Times New Roman" w:hAnsi="Times New Roman" w:cs="Times New Roman"/>
+        </w:rPr>
+        <w:tab/>
+        <w:t>While this can be argued as a non-functional feature, video games are an art form,</w:t>
+      </w:r>
+      <w:r>
+        <w:rPr>
+          <w:rFonts w:ascii="Times New Roman" w:hAnsi="Times New Roman" w:cs="Times New Roman"/>
+        </w:rPr>
+        <w:t xml:space="preserve"> and in the modern gaming landscape even indie games, when sold commercially, have an expectation of presentation. While I find my pixel art assets charming,</w:t>
+      </w:r>
+      <w:r>
+        <w:rPr>
+          <w:rFonts w:ascii="Times New Roman" w:hAnsi="Times New Roman" w:cs="Times New Roman"/>
+        </w:rPr>
+        <w:t xml:space="preserve"> and I don’t want the game to be too vibrant, presentation is extremely valuable for making a game feel worth its price. Even if I only </w:t>
+      </w:r>
+      <w:r>
+        <w:rPr>
+          <w:rFonts w:ascii="Times New Roman" w:hAnsi="Times New Roman" w:cs="Times New Roman"/>
+        </w:rPr>
+        <w:lastRenderedPageBreak/>
+        <w:t>sold it for a couple dollars, my competition is stiff.</w:t>
+      </w:r>
+      <w:r>
+        <w:rPr>
+          <w:rFonts w:ascii="Times New Roman" w:hAnsi="Times New Roman" w:cs="Times New Roman"/>
+        </w:rPr>
+        <w:t xml:space="preserve"> Animations, more </w:t>
+      </w:r>
+      <w:r>
+        <w:rPr>
+          <w:rFonts w:ascii="Times New Roman" w:hAnsi="Times New Roman" w:cs="Times New Roman"/>
+        </w:rPr>
+        <w:t>professional-looking</w:t>
+      </w:r>
+      <w:r>
+        <w:rPr>
+          <w:rFonts w:ascii="Times New Roman" w:hAnsi="Times New Roman" w:cs="Times New Roman"/>
+        </w:rPr>
+        <w:t xml:space="preserve"> assets, and a more deliberate </w:t>
+      </w:r>
+      <w:r>
+        <w:rPr>
+          <w:rFonts w:ascii="Times New Roman" w:hAnsi="Times New Roman" w:cs="Times New Roman"/>
+        </w:rPr>
+        <w:t>art style</w:t>
+      </w:r>
+      <w:r>
+        <w:rPr>
+          <w:rFonts w:ascii="Times New Roman" w:hAnsi="Times New Roman" w:cs="Times New Roman"/>
+        </w:rPr>
+        <w:t xml:space="preserve"> could greatly help in making the game presentable.</w:t>
+      </w:r>
+    </w:p>
+    <w:p>
+      <w:pPr>
+        <w:rPr>
+          <w:rFonts w:ascii="Times New Roman" w:hAnsi="Times New Roman" w:cs="Times New Roman"/>
+        </w:rPr>
+      </w:pPr>
+      <w:r>
+        <w:rPr>
+          <w:rFonts w:ascii="Times New Roman" w:hAnsi="Times New Roman" w:cs="Times New Roman"/>
+          <w:b/>
+          <w:bCs/>
+        </w:rPr>
+        <w:t>Non-Functional Features</w:t>
+      </w:r>
+    </w:p>
+    <w:p>
+      <w:pPr>
+        <w:rPr>
+          <w:rFonts w:ascii="Times New Roman" w:hAnsi="Times New Roman" w:cs="Times New Roman"/>
+        </w:rPr>
+      </w:pPr>
+      <w:r>
+        <w:rPr>
+          <w:rFonts w:ascii="Times New Roman" w:hAnsi="Times New Roman" w:cs="Times New Roman"/>
+        </w:rPr>
+        <w:tab/>
+      </w:r>
+      <w:r>
+        <w:rPr>
+          <w:rFonts w:ascii="Times New Roman" w:hAnsi="Times New Roman" w:cs="Times New Roman"/>
+        </w:rPr>
+        <w:t xml:space="preserve">I can’t necessarily say that my </w:t>
+      </w:r>
+      <w:r>
+        <w:rPr>
+          <w:rFonts w:ascii="Times New Roman" w:hAnsi="Times New Roman" w:cs="Times New Roman"/>
+        </w:rPr>
+        <w:t xml:space="preserve">game is designed to promote healthy work habits when its purpose is to keep users at their computer for as long as possible. Sure, that’s the part of extended work periods that I struggle with the most, but first, there’s a reason I feel the urge to get up and walk around while I work, it is healthy for you. And second, </w:t>
+      </w:r>
+      <w:r>
+        <w:rPr>
+          <w:rFonts w:ascii="Times New Roman" w:hAnsi="Times New Roman" w:cs="Times New Roman"/>
+        </w:rPr>
+        <w:t>as I’ll get into in the next section, my experience is not universal. Some may have the opposite issue. As such, I think adding a feature to direct the user to take regular breaks is a strong idea. I can incentivize this with game progress perhaps, for example i</w:t>
+      </w:r>
+      <w:r>
+        <w:rPr>
+          <w:rFonts w:ascii="Times New Roman" w:hAnsi="Times New Roman" w:cs="Times New Roman"/>
+        </w:rPr>
+        <w:t>f the user stops using their keyboard for a couple minutes when prompted, usually around every hour or so, they might be given an in-game cash prize</w:t>
+      </w:r>
+      <w:r>
+        <w:rPr>
+          <w:rFonts w:ascii="Times New Roman" w:hAnsi="Times New Roman" w:cs="Times New Roman"/>
+        </w:rPr>
+        <w:t xml:space="preserve"> to incentivize taking short, but semi-frequent breaks.</w:t>
+      </w:r>
+    </w:p>
+    <w:p>
+      <w:pPr>
+        <w:rPr>
+          <w:rFonts w:ascii="Times New Roman" w:hAnsi="Times New Roman" w:cs="Times New Roman"/>
+        </w:rPr>
+      </w:pPr>
+      <w:r>
+        <w:rPr>
+          <w:rFonts w:ascii="Times New Roman" w:hAnsi="Times New Roman" w:cs="Times New Roman"/>
+        </w:rPr>
+        <w:tab/>
+      </w:r>
+      <w:r>
+        <w:rPr>
+          <w:rFonts w:ascii="Times New Roman" w:hAnsi="Times New Roman" w:cs="Times New Roman"/>
+        </w:rPr>
+        <w:t xml:space="preserve">From the start I had intended to market this game towards students, particularly </w:t>
+      </w:r>
+      <w:r>
+        <w:rPr>
+          <w:rFonts w:ascii="Times New Roman" w:hAnsi="Times New Roman" w:cs="Times New Roman"/>
+        </w:rPr>
+        <w:t xml:space="preserve">with neurodivergence. When considering future improvements for a commercial release though, I should consider the state of the gaming market and where my game could fit. </w:t>
+      </w:r>
+      <w:r>
+        <w:rPr>
+          <w:rFonts w:ascii="Times New Roman" w:hAnsi="Times New Roman" w:cs="Times New Roman"/>
+        </w:rPr>
+        <w:t xml:space="preserve">Moving more into the general </w:t>
+      </w:r>
+      <w:r>
+        <w:rPr>
+          <w:rFonts w:ascii="Times New Roman" w:hAnsi="Times New Roman" w:cs="Times New Roman"/>
+        </w:rPr>
+        <w:t>vibe</w:t>
+      </w:r>
+      <w:r>
+        <w:rPr>
+          <w:rFonts w:ascii="Times New Roman" w:hAnsi="Times New Roman" w:cs="Times New Roman"/>
+        </w:rPr>
+        <w:t xml:space="preserve"> of the game, the market I am appealing to is something of an intersection between </w:t>
+      </w:r>
+      <w:r>
+        <w:rPr>
+          <w:rFonts w:ascii="Times New Roman" w:hAnsi="Times New Roman" w:cs="Times New Roman"/>
+        </w:rPr>
+        <w:t>corner games and the recent “cozy games” craze. Often jokingly referred to as “mom games,” cozy games</w:t>
+      </w:r>
+      <w:r>
+        <w:rPr>
+          <w:rFonts w:ascii="Times New Roman" w:hAnsi="Times New Roman" w:cs="Times New Roman"/>
+        </w:rPr>
+        <w:t xml:space="preserve"> are usually identified by low stakes, slow gameplay with a cutesy art style and, something missing from Cornursery, a collection aspect. Completionists and cozy gamers alike tend to enjoy filling out </w:t>
+      </w:r>
+      <w:r>
+        <w:rPr>
+          <w:rFonts w:ascii="Times New Roman" w:hAnsi="Times New Roman" w:cs="Times New Roman"/>
+        </w:rPr>
+        <w:t>collections</w:t>
+      </w:r>
+      <w:r>
+        <w:rPr>
+          <w:rFonts w:ascii="Times New Roman" w:hAnsi="Times New Roman" w:cs="Times New Roman"/>
+        </w:rPr>
+        <w:t xml:space="preserve"> in this type of game, it’s one of the strongest aspects of foolsroom’s </w:t>
+      </w:r>
+      <w:r>
+        <w:rPr>
+          <w:rFonts w:ascii="Times New Roman" w:hAnsi="Times New Roman" w:cs="Times New Roman"/>
+          <w:i/>
+          <w:iCs/>
+        </w:rPr>
+        <w:t>Cornerpond</w:t>
+      </w:r>
+      <w:r>
+        <w:rPr>
+          <w:rFonts w:ascii="Times New Roman" w:hAnsi="Times New Roman" w:cs="Times New Roman"/>
+        </w:rPr>
+        <w:t xml:space="preserve">. </w:t>
+      </w:r>
+      <w:r>
+        <w:rPr>
+          <w:rFonts w:ascii="Times New Roman" w:hAnsi="Times New Roman" w:cs="Times New Roman"/>
+        </w:rPr>
+        <w:t>As such, having a collection aspect with an end goal along the lines of “unlock every plant’s entry in the Compendium” is a strong contender for both a progression system and an overarching objective for cozy gamers and completionists. This also doubles as having a concrete milestone system to help set up achievements on an online marketplace, which can serve as a secondary motivator to have the game running while you work.</w:t>
+      </w:r>
+    </w:p>
+    <w:p>
+      <w:pPr>
+        <w:rPr>
+          <w:rFonts w:ascii="Times New Roman" w:hAnsi="Times New Roman" w:cs="Times New Roman"/>
+        </w:rPr>
+      </w:pPr>
+      <w:r>
+        <w:rPr>
+          <w:rFonts w:ascii="Times New Roman" w:hAnsi="Times New Roman" w:cs="Times New Roman"/>
+        </w:rPr>
+        <w:tab/>
+        <w:t xml:space="preserve">But </w:t>
+      </w:r>
+      <w:r>
+        <w:rPr>
+          <w:rFonts w:ascii="Times New Roman" w:hAnsi="Times New Roman" w:cs="Times New Roman"/>
+        </w:rPr>
+        <w:t>to</w:t>
+      </w:r>
+      <w:r>
+        <w:rPr>
+          <w:rFonts w:ascii="Times New Roman" w:hAnsi="Times New Roman" w:cs="Times New Roman"/>
+        </w:rPr>
+        <w:t xml:space="preserve"> fill out the pages of our “compendium,” more plants is a must. The game only has two right now</w:t>
+      </w:r>
+      <w:r>
+        <w:rPr>
+          <w:rFonts w:ascii="Times New Roman" w:hAnsi="Times New Roman" w:cs="Times New Roman"/>
+        </w:rPr>
+        <w:t xml:space="preserve">, but originally I had plants to incorporate all kinds of plants. This sadly didn’t pan out, as just creating one plant usually requires between 3-6 sprites and </w:t>
+      </w:r>
+      <w:r>
+        <w:rPr>
+          <w:rFonts w:ascii="Times New Roman" w:hAnsi="Times New Roman" w:cs="Times New Roman"/>
+        </w:rPr>
+        <w:t>thorough experimentation, but having many, many more is a must. I included some method overloading in the planting method to enable specific inputs when planting new plants, so I’d hope to tie this into another progression system to allow players to purchase new seeds that would help unlock new plants for their compendium.</w:t>
+      </w:r>
+    </w:p>
+    <w:p>
+      <w:pPr>
+        <w:rPr>
+          <w:rFonts w:ascii="Times New Roman" w:hAnsi="Times New Roman" w:cs="Times New Roman"/>
+        </w:rPr>
+      </w:pPr>
+      <w:r>
+        <w:rPr>
+          <w:rFonts w:ascii="Times New Roman" w:hAnsi="Times New Roman" w:cs="Times New Roman"/>
+        </w:rPr>
+        <w:tab/>
+        <w:t>To support that above plan though, on top of the better presentation I mentioned in the functional features,</w:t>
+      </w:r>
+      <w:r>
+        <w:rPr>
+          <w:rFonts w:ascii="Times New Roman" w:hAnsi="Times New Roman" w:cs="Times New Roman"/>
+        </w:rPr>
+        <w:t xml:space="preserve"> I would need more progression systems. A seed shop, a level system that scales to the number of plants sold, shop expansions, cosmetics, upgrades, and so on are all possible progression systems to add and implement. In particular, the </w:t>
+      </w:r>
+      <w:r>
+        <w:rPr>
+          <w:rFonts w:ascii="Times New Roman" w:hAnsi="Times New Roman" w:cs="Times New Roman"/>
+        </w:rPr>
+        <w:t>cozy</w:t>
+      </w:r>
+      <w:r>
+        <w:rPr>
+          <w:rFonts w:ascii="Times New Roman" w:hAnsi="Times New Roman" w:cs="Times New Roman"/>
+        </w:rPr>
+        <w:t xml:space="preserve"> game genre tends to emphasize unlockable cosmetics and extensive character and space customization. The player doesn’t have a character in Cornursery, but letting </w:t>
+      </w:r>
+      <w:r>
+        <w:rPr>
+          <w:rFonts w:ascii="Times New Roman" w:hAnsi="Times New Roman" w:cs="Times New Roman"/>
+        </w:rPr>
+        <w:t xml:space="preserve">players customize and decorate their desk and </w:t>
+      </w:r>
+      <w:r>
+        <w:rPr>
+          <w:rFonts w:ascii="Times New Roman" w:hAnsi="Times New Roman" w:cs="Times New Roman"/>
+        </w:rPr>
+        <w:lastRenderedPageBreak/>
+        <w:t>maybe even</w:t>
+      </w:r>
+      <w:r>
+        <w:rPr>
+          <w:rFonts w:ascii="Times New Roman" w:hAnsi="Times New Roman" w:cs="Times New Roman"/>
+        </w:rPr>
+        <w:t xml:space="preserve"> a</w:t>
+      </w:r>
+      <w:r>
+        <w:rPr>
+          <w:rFonts w:ascii="Times New Roman" w:hAnsi="Times New Roman" w:cs="Times New Roman"/>
+        </w:rPr>
+        <w:t xml:space="preserve"> shop with items they can purchase with in-game currency wouldn’t just be a strong motivator, to some it would be </w:t>
+      </w:r>
+      <w:r>
+        <w:rPr>
+          <w:rFonts w:ascii="Times New Roman" w:hAnsi="Times New Roman" w:cs="Times New Roman"/>
+          <w:i/>
+          <w:iCs/>
+        </w:rPr>
+        <w:t>the</w:t>
+      </w:r>
+      <w:r>
+        <w:rPr>
+          <w:rFonts w:ascii="Times New Roman" w:hAnsi="Times New Roman" w:cs="Times New Roman"/>
+        </w:rPr>
+        <w:t xml:space="preserve"> motivator, and what separates a project from a commercial title.</w:t>
+      </w:r>
+    </w:p>
+    <w:p>
+      <w:pPr>
+        <w:rPr>
+          <w:rFonts w:ascii="Times New Roman" w:hAnsi="Times New Roman" w:cs="Times New Roman"/>
+        </w:rPr>
+      </w:pPr>
+      <w:r>
+        <w:rPr>
+          <w:rFonts w:ascii="Times New Roman" w:hAnsi="Times New Roman" w:cs="Times New Roman"/>
+        </w:rPr>
+        <w:tab/>
+        <w:t xml:space="preserve">A more in depth implementation of the game may also allow users to store some of the plants they grow in a favorites tab, </w:t>
+      </w:r>
+      <w:r>
+        <w:rPr>
+          <w:rFonts w:ascii="Times New Roman" w:hAnsi="Times New Roman" w:cs="Times New Roman"/>
+        </w:rPr>
+        <w:t xml:space="preserve">particularly if I were to introduce variances in plant size and shape. As of now the only way to grow a new plant is to sell the current one when it hits its final stage, </w:t>
+      </w:r>
+      <w:r>
+        <w:rPr>
+          <w:rFonts w:ascii="Times New Roman" w:hAnsi="Times New Roman" w:cs="Times New Roman"/>
+        </w:rPr>
+        <w:t>but perhaps allowing users to set up a display with their favorite plants would be a strong motivator to seek out new plants.</w:t>
+      </w:r>
+    </w:p>
+    <w:p>
+      <w:pPr>
+        <w:rPr>
+          <w:rFonts w:ascii="Times New Roman" w:hAnsi="Times New Roman" w:cs="Times New Roman"/>
+        </w:rPr>
+      </w:pPr>
+      <w:r>
+        <w:rPr>
+          <w:rFonts w:ascii="Times New Roman" w:hAnsi="Times New Roman" w:cs="Times New Roman"/>
+        </w:rPr>
+        <w:tab/>
+        <w:t xml:space="preserve">Lastly, I considered creating multiple tasks when first creating this </w:t>
+      </w:r>
+      <w:r>
+        <w:rPr>
+          <w:rFonts w:ascii="Times New Roman" w:hAnsi="Times New Roman" w:cs="Times New Roman"/>
+        </w:rPr>
+        <w:t>assignment but</w:t>
+      </w:r>
+      <w:r>
+        <w:rPr>
+          <w:rFonts w:ascii="Times New Roman" w:hAnsi="Times New Roman" w:cs="Times New Roman"/>
+        </w:rPr>
+        <w:t xml:space="preserve"> decided against it as they would each functionally do the same thing, only with different buttons and lines of code. </w:t>
+      </w:r>
+      <w:r>
+        <w:rPr>
+          <w:rFonts w:ascii="Times New Roman" w:hAnsi="Times New Roman" w:cs="Times New Roman"/>
+        </w:rPr>
+        <w:t>I think incorporating multiple tasks could work, but only if tasks were given brief minigames, which I worried could make the game too distracting. Nonetheless I think the idea is worth mentioning here.</w:t>
+      </w:r>
+    </w:p>
+    <w:p>
+      <w:pPr>
+        <w:rPr>
+          <w:rFonts w:ascii="Times New Roman" w:hAnsi="Times New Roman" w:cs="Times New Roman"/>
+        </w:rPr>
+      </w:pPr>
+    </w:p>
+    <w:p>
+      <w:pPr>
+        <w:rPr>
+          <w:rFonts w:ascii="Times New Roman" w:hAnsi="Times New Roman" w:cs="Times New Roman"/>
+        </w:rPr>
+      </w:pPr>
+    </w:p>
+    <w:p>
+      <w:pPr>
+        <w:rPr>
+          <w:rFonts w:ascii="Times New Roman" w:hAnsi="Times New Roman" w:cs="Times New Roman"/>
+        </w:rPr>
+      </w:pPr>
+    </w:p>
+    <w:p>
+      <w:pPr>
+        <w:rPr>
+          <w:rFonts w:ascii="Times New Roman" w:hAnsi="Times New Roman" w:cs="Times New Roman"/>
+        </w:rPr>
+      </w:pPr>
+    </w:p>
+    <w:p>
+      <w:pPr>
+        <w:rPr>
+          <w:rFonts w:ascii="Times New Roman" w:hAnsi="Times New Roman" w:cs="Times New Roman"/>
+        </w:rPr>
+      </w:pPr>
+    </w:p>
+    <w:p>
+      <w:pPr>
+        <w:rPr>
+          <w:rFonts w:ascii="Times New Roman" w:hAnsi="Times New Roman" w:cs="Times New Roman"/>
+        </w:rPr>
+      </w:pPr>
+    </w:p>
+    <w:p>
+      <w:pPr>
+        <w:rPr>
+          <w:rFonts w:ascii="Times New Roman" w:hAnsi="Times New Roman" w:cs="Times New Roman"/>
+        </w:rPr>
+      </w:pPr>
+    </w:p>
+    <w:p>
+      <w:pPr>
+        <w:rPr>
+          <w:rFonts w:ascii="Times New Roman" w:hAnsi="Times New Roman" w:cs="Times New Roman"/>
+        </w:rPr>
+      </w:pPr>
+    </w:p>
+    <w:p>
+      <w:pPr>
+        <w:rPr>
+          <w:rFonts w:ascii="Times New Roman" w:hAnsi="Times New Roman" w:cs="Times New Roman"/>
+        </w:rPr>
+      </w:pPr>
+    </w:p>
+    <w:p>
+      <w:pPr>
+        <w:rPr>
+          <w:rFonts w:ascii="Times New Roman" w:hAnsi="Times New Roman" w:cs="Times New Roman"/>
+        </w:rPr>
+      </w:pPr>
+    </w:p>
+    <w:p>
+      <w:pPr>
+        <w:rPr>
+          <w:rFonts w:ascii="Times New Roman" w:hAnsi="Times New Roman" w:cs="Times New Roman"/>
+        </w:rPr>
+      </w:pPr>
+    </w:p>
+    <w:p>
+      <w:pPr>
+        <w:rPr>
+          <w:rFonts w:ascii="Times New Roman" w:hAnsi="Times New Roman" w:cs="Times New Roman"/>
+        </w:rPr>
+      </w:pPr>
+    </w:p>
+    <w:p>
+      <w:pPr>
+        <w:rPr>
+          <w:rFonts w:ascii="Times New Roman" w:hAnsi="Times New Roman" w:cs="Times New Roman"/>
+        </w:rPr>
+      </w:pPr>
+    </w:p>
+    <w:p>
+      <w:pPr>
+        <w:rPr>
+          <w:rFonts w:ascii="Times New Roman" w:hAnsi="Times New Roman" w:cs="Times New Roman"/>
+        </w:rPr>
+      </w:pPr>
+    </w:p>
+    <w:p>
+      <w:pPr>
+        <w:rPr>
+          <w:rFonts w:ascii="Times New Roman" w:hAnsi="Times New Roman" w:cs="Times New Roman"/>
+        </w:rPr>
+      </w:pPr>
+    </w:p>
+    <w:p>
+      <w:pPr>
+        <w:rPr>
+          <w:rFonts w:ascii="Times New Roman" w:hAnsi="Times New Roman" w:cs="Times New Roman"/>
+        </w:rPr>
+      </w:pPr>
+    </w:p>
+    <w:p>
+      <w:pPr>
+        <w:rPr>
+          <w:rFonts w:ascii="Times New Roman" w:hAnsi="Times New Roman" w:cs="Times New Roman"/>
+        </w:rPr>
+      </w:pPr>
+    </w:p>
+    <w:p>
+      <w:pPr>
+        <w:rPr>
+          <w:rFonts w:ascii="Times New Roman" w:hAnsi="Times New Roman" w:cs="Times New Roman"/>
+        </w:rPr>
+      </w:pPr>
+    </w:p>
+    <w:p>
+      <w:pPr>
+        <w:rPr>
+          <w:rFonts w:ascii="Times New Roman" w:hAnsi="Times New Roman" w:cs="Times New Roman"/>
+        </w:rPr>
+      </w:pPr>
+    </w:p>
+    <w:p>
+      <w:pPr>
+        <w:rPr>
+          <w:rFonts w:ascii="Times New Roman" w:hAnsi="Times New Roman" w:cs="Times New Roman"/>
+        </w:rPr>
+      </w:pPr>
+    </w:p>
+    <w:p>
+      <w:pPr>
         <w:rPr>
           <w:rFonts w:ascii="Times New Roman" w:hAnsi="Times New Roman" w:cs="Times New Roman"/>
           <w:b/>
@@ -2172,28 +4504,6 @@
           <w:sz w:val="28"/>
           <w:szCs w:val="28"/>
         </w:rPr>
-        <w:lastRenderedPageBreak/>
-        <w:t>Ethics and Acknowledgements</w:t>
-      </w:r>
-    </w:p>
-    <w:p>
-      <w:pPr>
-        <w:rPr>
-          <w:rFonts w:ascii="Times New Roman" w:hAnsi="Times New Roman" w:cs="Times New Roman"/>
-        </w:rPr>
-      </w:pPr>
-      <w:r>
-        <w:rPr>
-          <w:rFonts w:ascii="Times New Roman" w:hAnsi="Times New Roman" w:cs="Times New Roman"/>
-        </w:rPr>
-        <w:t>Talk about the variances in neurodivergency!</w:t>
-      </w:r>
-    </w:p>
-    <w:p>
-      <w:pPr>
-        <w:rPr>
-          <w:rFonts w:ascii="Times New Roman" w:hAnsi="Times New Roman" w:cs="Times New Roman"/>
-        </w:rPr>
       </w:pPr>
       <w:r>
         <w:rPr>
@@ -2203,52 +4513,204 @@
           <w:sz w:val="28"/>
           <w:szCs w:val="28"/>
         </w:rPr>
-        <w:t>Conclusion</w:t>
-      </w:r>
-    </w:p>
-    <w:p>
-      <w:pPr>
-        <w:rPr>
-          <w:rFonts w:ascii="Times New Roman" w:hAnsi="Times New Roman" w:cs="Times New Roman"/>
-        </w:rPr>
-      </w:pPr>
-      <w:r>
-        <w:rPr>
-          <w:rFonts w:ascii="Times New Roman" w:hAnsi="Times New Roman" w:cs="Times New Roman"/>
-        </w:rPr>
-        <w:tab/>
-        <w:t xml:space="preserve">I admittedly don’t have much to write here now, conclusions are best written once you’ve </w:t>
-      </w:r>
-      <w:r>
-        <w:rPr>
-          <w:rFonts w:ascii="Times New Roman" w:hAnsi="Times New Roman" w:cs="Times New Roman"/>
-        </w:rPr>
-        <w:t>written</w:t>
-      </w:r>
-      <w:r>
-        <w:rPr>
-          <w:rFonts w:ascii="Times New Roman" w:hAnsi="Times New Roman" w:cs="Times New Roman"/>
-        </w:rPr>
-        <w:t xml:space="preserve"> the report and have a chance to reflect. </w:t>
-      </w:r>
-    </w:p>
-    <w:p>
-      <w:pPr>
-        <w:rPr>
-          <w:rFonts w:ascii="Times New Roman" w:hAnsi="Times New Roman" w:cs="Times New Roman"/>
-        </w:rPr>
-      </w:pPr>
-    </w:p>
-    <w:p>
-      <w:pPr>
-        <w:rPr>
-          <w:rFonts w:ascii="Times New Roman" w:hAnsi="Times New Roman" w:cs="Times New Roman"/>
-        </w:rPr>
-      </w:pPr>
-    </w:p>
-    <w:p>
-      <w:pPr>
-        <w:jc w:val="center"/>
+        <w:t>Ethics and Acknowledgements</w:t>
+      </w:r>
+    </w:p>
+    <w:p>
+      <w:pPr>
+        <w:rPr>
+          <w:rFonts w:ascii="Times New Roman" w:hAnsi="Times New Roman" w:cs="Times New Roman"/>
+        </w:rPr>
+      </w:pPr>
+      <w:r>
+        <w:rPr>
+          <w:rFonts w:ascii="Times New Roman" w:hAnsi="Times New Roman" w:cs="Times New Roman"/>
+        </w:rPr>
+        <w:t>Talk about the variances in neurodivergency!</w:t>
+      </w:r>
+    </w:p>
+    <w:p>
+      <w:pPr>
+        <w:rPr>
+          <w:rFonts w:ascii="Times New Roman" w:hAnsi="Times New Roman" w:cs="Times New Roman"/>
+        </w:rPr>
+      </w:pPr>
+    </w:p>
+    <w:p>
+      <w:pPr>
+        <w:rPr>
+          <w:rFonts w:ascii="Times New Roman" w:hAnsi="Times New Roman" w:cs="Times New Roman"/>
+        </w:rPr>
+      </w:pPr>
+    </w:p>
+    <w:p>
+      <w:pPr>
+        <w:rPr>
+          <w:rFonts w:ascii="Times New Roman" w:hAnsi="Times New Roman" w:cs="Times New Roman"/>
+        </w:rPr>
+      </w:pPr>
+    </w:p>
+    <w:p>
+      <w:pPr>
+        <w:rPr>
+          <w:rFonts w:ascii="Times New Roman" w:hAnsi="Times New Roman" w:cs="Times New Roman"/>
+        </w:rPr>
+      </w:pPr>
+    </w:p>
+    <w:p>
+      <w:pPr>
+        <w:rPr>
+          <w:rFonts w:ascii="Times New Roman" w:hAnsi="Times New Roman" w:cs="Times New Roman"/>
+        </w:rPr>
+      </w:pPr>
+    </w:p>
+    <w:p>
+      <w:pPr>
+        <w:rPr>
+          <w:rFonts w:ascii="Times New Roman" w:hAnsi="Times New Roman" w:cs="Times New Roman"/>
+        </w:rPr>
+      </w:pPr>
+    </w:p>
+    <w:p>
+      <w:pPr>
+        <w:rPr>
+          <w:rFonts w:ascii="Times New Roman" w:hAnsi="Times New Roman" w:cs="Times New Roman"/>
+        </w:rPr>
+      </w:pPr>
+    </w:p>
+    <w:p>
+      <w:pPr>
+        <w:rPr>
+          <w:rFonts w:ascii="Times New Roman" w:hAnsi="Times New Roman" w:cs="Times New Roman"/>
+        </w:rPr>
+      </w:pPr>
+    </w:p>
+    <w:p>
+      <w:pPr>
+        <w:rPr>
+          <w:rFonts w:ascii="Times New Roman" w:hAnsi="Times New Roman" w:cs="Times New Roman"/>
+        </w:rPr>
+      </w:pPr>
+    </w:p>
+    <w:p>
+      <w:pPr>
+        <w:rPr>
+          <w:rFonts w:ascii="Times New Roman" w:hAnsi="Times New Roman" w:cs="Times New Roman"/>
+        </w:rPr>
+      </w:pPr>
+    </w:p>
+    <w:p>
+      <w:pPr>
+        <w:rPr>
+          <w:rFonts w:ascii="Times New Roman" w:hAnsi="Times New Roman" w:cs="Times New Roman"/>
+        </w:rPr>
+      </w:pPr>
+    </w:p>
+    <w:p>
+      <w:pPr>
+        <w:rPr>
+          <w:rFonts w:ascii="Times New Roman" w:hAnsi="Times New Roman" w:cs="Times New Roman"/>
+        </w:rPr>
+      </w:pPr>
+    </w:p>
+    <w:p>
+      <w:pPr>
+        <w:rPr>
+          <w:rFonts w:ascii="Times New Roman" w:hAnsi="Times New Roman" w:cs="Times New Roman"/>
+        </w:rPr>
+      </w:pPr>
+    </w:p>
+    <w:p>
+      <w:pPr>
+        <w:rPr>
+          <w:rFonts w:ascii="Times New Roman" w:hAnsi="Times New Roman" w:cs="Times New Roman"/>
+        </w:rPr>
+      </w:pPr>
+    </w:p>
+    <w:p>
+      <w:pPr>
+        <w:rPr>
+          <w:rFonts w:ascii="Times New Roman" w:hAnsi="Times New Roman" w:cs="Times New Roman"/>
+        </w:rPr>
+      </w:pPr>
+    </w:p>
+    <w:p>
+      <w:pPr>
+        <w:rPr>
+          <w:rFonts w:ascii="Times New Roman" w:hAnsi="Times New Roman" w:cs="Times New Roman"/>
+        </w:rPr>
+      </w:pPr>
+    </w:p>
+    <w:p>
+      <w:pPr>
+        <w:rPr>
+          <w:rFonts w:ascii="Times New Roman" w:hAnsi="Times New Roman" w:cs="Times New Roman"/>
+        </w:rPr>
+      </w:pPr>
+    </w:p>
+    <w:p>
+      <w:pPr>
+        <w:rPr>
+          <w:rFonts w:ascii="Times New Roman" w:hAnsi="Times New Roman" w:cs="Times New Roman"/>
+        </w:rPr>
+      </w:pPr>
+    </w:p>
+    <w:p>
+      <w:pPr>
+        <w:rPr>
+          <w:rFonts w:ascii="Times New Roman" w:hAnsi="Times New Roman" w:cs="Times New Roman"/>
+        </w:rPr>
+      </w:pPr>
+    </w:p>
+    <w:p>
+      <w:pPr>
+        <w:rPr>
+          <w:rFonts w:ascii="Times New Roman" w:hAnsi="Times New Roman" w:cs="Times New Roman"/>
+        </w:rPr>
+      </w:pPr>
+    </w:p>
+    <w:p>
+      <w:pPr>
+        <w:rPr>
+          <w:rFonts w:ascii="Times New Roman" w:hAnsi="Times New Roman" w:cs="Times New Roman"/>
+        </w:rPr>
+      </w:pPr>
+    </w:p>
+    <w:p>
+      <w:pPr>
+        <w:rPr>
+          <w:rFonts w:ascii="Times New Roman" w:hAnsi="Times New Roman" w:cs="Times New Roman"/>
+        </w:rPr>
+      </w:pPr>
+    </w:p>
+    <w:p>
+      <w:pPr>
+        <w:rPr>
+          <w:rFonts w:ascii="Times New Roman" w:hAnsi="Times New Roman" w:cs="Times New Roman"/>
+        </w:rPr>
+      </w:pPr>
+    </w:p>
+    <w:p>
+      <w:pPr>
+        <w:rPr>
+          <w:rFonts w:ascii="Times New Roman" w:hAnsi="Times New Roman" w:cs="Times New Roman"/>
+        </w:rPr>
+      </w:pPr>
+    </w:p>
+    <w:p>
+      <w:pPr>
+        <w:rPr>
+          <w:rFonts w:ascii="Times New Roman" w:hAnsi="Times New Roman" w:cs="Times New Roman"/>
+        </w:rPr>
+      </w:pPr>
+    </w:p>
+    <w:p>
+      <w:pPr>
+        <w:rPr>
+          <w:rFonts w:ascii="Times New Roman" w:hAnsi="Times New Roman" w:cs="Times New Roman"/>
+        </w:rPr>
+      </w:pPr>
+      <w:r>
         <w:rPr>
           <w:rFonts w:ascii="Times New Roman" w:hAnsi="Times New Roman" w:cs="Times New Roman"/>
           <w:b/>
@@ -2256,8 +4718,206 @@
           <w:sz w:val="28"/>
           <w:szCs w:val="28"/>
         </w:rPr>
-      </w:pPr>
-      <w:r>
+        <w:t>Conclusion</w:t>
+      </w:r>
+    </w:p>
+    <w:p>
+      <w:pPr>
+        <w:rPr>
+          <w:rFonts w:ascii="Times New Roman" w:hAnsi="Times New Roman" w:cs="Times New Roman"/>
+        </w:rPr>
+      </w:pPr>
+      <w:r>
+        <w:rPr>
+          <w:rFonts w:ascii="Times New Roman" w:hAnsi="Times New Roman" w:cs="Times New Roman"/>
+        </w:rPr>
+        <w:tab/>
+        <w:t xml:space="preserve">I admittedly don’t have much to write here now, conclusions are best written once you’ve </w:t>
+      </w:r>
+      <w:r>
+        <w:rPr>
+          <w:rFonts w:ascii="Times New Roman" w:hAnsi="Times New Roman" w:cs="Times New Roman"/>
+        </w:rPr>
+        <w:t>written</w:t>
+      </w:r>
+      <w:r>
+        <w:rPr>
+          <w:rFonts w:ascii="Times New Roman" w:hAnsi="Times New Roman" w:cs="Times New Roman"/>
+        </w:rPr>
+        <w:t xml:space="preserve"> the report and have a chance to reflect. </w:t>
+      </w:r>
+    </w:p>
+    <w:p>
+      <w:pPr>
+        <w:rPr>
+          <w:rFonts w:ascii="Times New Roman" w:hAnsi="Times New Roman" w:cs="Times New Roman"/>
+        </w:rPr>
+      </w:pPr>
+    </w:p>
+    <w:p>
+      <w:pPr>
+        <w:rPr>
+          <w:rFonts w:ascii="Times New Roman" w:hAnsi="Times New Roman" w:cs="Times New Roman"/>
+        </w:rPr>
+      </w:pPr>
+    </w:p>
+    <w:p>
+      <w:pPr>
+        <w:rPr>
+          <w:rFonts w:ascii="Times New Roman" w:hAnsi="Times New Roman" w:cs="Times New Roman"/>
+        </w:rPr>
+      </w:pPr>
+    </w:p>
+    <w:p>
+      <w:pPr>
+        <w:rPr>
+          <w:rFonts w:ascii="Times New Roman" w:hAnsi="Times New Roman" w:cs="Times New Roman"/>
+        </w:rPr>
+      </w:pPr>
+    </w:p>
+    <w:p>
+      <w:pPr>
+        <w:rPr>
+          <w:rFonts w:ascii="Times New Roman" w:hAnsi="Times New Roman" w:cs="Times New Roman"/>
+        </w:rPr>
+      </w:pPr>
+    </w:p>
+    <w:p>
+      <w:pPr>
+        <w:rPr>
+          <w:rFonts w:ascii="Times New Roman" w:hAnsi="Times New Roman" w:cs="Times New Roman"/>
+        </w:rPr>
+      </w:pPr>
+    </w:p>
+    <w:p>
+      <w:pPr>
+        <w:rPr>
+          <w:rFonts w:ascii="Times New Roman" w:hAnsi="Times New Roman" w:cs="Times New Roman"/>
+        </w:rPr>
+      </w:pPr>
+    </w:p>
+    <w:p>
+      <w:pPr>
+        <w:rPr>
+          <w:rFonts w:ascii="Times New Roman" w:hAnsi="Times New Roman" w:cs="Times New Roman"/>
+        </w:rPr>
+      </w:pPr>
+    </w:p>
+    <w:p>
+      <w:pPr>
+        <w:rPr>
+          <w:rFonts w:ascii="Times New Roman" w:hAnsi="Times New Roman" w:cs="Times New Roman"/>
+        </w:rPr>
+      </w:pPr>
+    </w:p>
+    <w:p>
+      <w:pPr>
+        <w:rPr>
+          <w:rFonts w:ascii="Times New Roman" w:hAnsi="Times New Roman" w:cs="Times New Roman"/>
+        </w:rPr>
+      </w:pPr>
+    </w:p>
+    <w:p>
+      <w:pPr>
+        <w:rPr>
+          <w:rFonts w:ascii="Times New Roman" w:hAnsi="Times New Roman" w:cs="Times New Roman"/>
+        </w:rPr>
+      </w:pPr>
+    </w:p>
+    <w:p>
+      <w:pPr>
+        <w:rPr>
+          <w:rFonts w:ascii="Times New Roman" w:hAnsi="Times New Roman" w:cs="Times New Roman"/>
+        </w:rPr>
+      </w:pPr>
+    </w:p>
+    <w:p>
+      <w:pPr>
+        <w:rPr>
+          <w:rFonts w:ascii="Times New Roman" w:hAnsi="Times New Roman" w:cs="Times New Roman"/>
+        </w:rPr>
+      </w:pPr>
+    </w:p>
+    <w:p>
+      <w:pPr>
+        <w:rPr>
+          <w:rFonts w:ascii="Times New Roman" w:hAnsi="Times New Roman" w:cs="Times New Roman"/>
+        </w:rPr>
+      </w:pPr>
+    </w:p>
+    <w:p>
+      <w:pPr>
+        <w:rPr>
+          <w:rFonts w:ascii="Times New Roman" w:hAnsi="Times New Roman" w:cs="Times New Roman"/>
+        </w:rPr>
+      </w:pPr>
+    </w:p>
+    <w:p>
+      <w:pPr>
+        <w:rPr>
+          <w:rFonts w:ascii="Times New Roman" w:hAnsi="Times New Roman" w:cs="Times New Roman"/>
+        </w:rPr>
+      </w:pPr>
+    </w:p>
+    <w:p>
+      <w:pPr>
+        <w:rPr>
+          <w:rFonts w:ascii="Times New Roman" w:hAnsi="Times New Roman" w:cs="Times New Roman"/>
+        </w:rPr>
+      </w:pPr>
+    </w:p>
+    <w:p>
+      <w:pPr>
+        <w:rPr>
+          <w:rFonts w:ascii="Times New Roman" w:hAnsi="Times New Roman" w:cs="Times New Roman"/>
+        </w:rPr>
+      </w:pPr>
+    </w:p>
+    <w:p>
+      <w:pPr>
+        <w:rPr>
+          <w:rFonts w:ascii="Times New Roman" w:hAnsi="Times New Roman" w:cs="Times New Roman"/>
+        </w:rPr>
+      </w:pPr>
+    </w:p>
+    <w:p>
+      <w:pPr>
+        <w:rPr>
+          <w:rFonts w:ascii="Times New Roman" w:hAnsi="Times New Roman" w:cs="Times New Roman"/>
+        </w:rPr>
+      </w:pPr>
+    </w:p>
+    <w:p>
+      <w:pPr>
+        <w:rPr>
+          <w:rFonts w:ascii="Times New Roman" w:hAnsi="Times New Roman" w:cs="Times New Roman"/>
+        </w:rPr>
+      </w:pPr>
+    </w:p>
+    <w:p>
+      <w:pPr>
+        <w:rPr>
+          <w:rFonts w:ascii="Times New Roman" w:hAnsi="Times New Roman" w:cs="Times New Roman"/>
+        </w:rPr>
+      </w:pPr>
+    </w:p>
+    <w:p>
+      <w:pPr>
+        <w:rPr>
+          <w:rFonts w:ascii="Times New Roman" w:hAnsi="Times New Roman" w:cs="Times New Roman"/>
+        </w:rPr>
+      </w:pPr>
+    </w:p>
+    <w:p>
+      <w:pPr>
+        <w:rPr>
+          <w:rFonts w:ascii="Times New Roman" w:hAnsi="Times New Roman" w:cs="Times New Roman"/>
+        </w:rPr>
+      </w:pPr>
+    </w:p>
+    <w:p>
+      <w:pPr>
+        <w:jc w:val="center"/>
         <w:rPr>
           <w:rFonts w:ascii="Times New Roman" w:hAnsi="Times New Roman" w:cs="Times New Roman"/>
           <w:b/>
@@ -2265,6 +4925,15 @@
           <w:sz w:val="28"/>
           <w:szCs w:val="28"/>
         </w:rPr>
+      </w:pPr>
+      <w:r>
+        <w:rPr>
+          <w:rFonts w:ascii="Times New Roman" w:hAnsi="Times New Roman" w:cs="Times New Roman"/>
+          <w:b/>
+          <w:bCs/>
+          <w:sz w:val="28"/>
+          <w:szCs w:val="28"/>
+        </w:rPr>
         <w:t>References</w:t>
       </w:r>
     </w:p>
@@ -2360,7 +5029,7 @@
         </w:rPr>
         <w:t xml:space="preserve">, 2460–2476. </w:t>
       </w:r>
-      <w:hyperlink r:id="rId7" w:history="1">
+      <w:hyperlink r:id="rId15" w:history="1">
         <w:r>
           <w:rPr>
             <w:rStyle w:val="Hyperlink"/>
@@ -2430,7 +5099,7 @@
         </w:rPr>
         <w:t xml:space="preserve">(2), Article 5. </w:t>
       </w:r>
-      <w:hyperlink r:id="rId8" w:history="1">
+      <w:hyperlink r:id="rId16" w:history="1">
         <w:r>
           <w:rPr>
             <w:rStyle w:val="Hyperlink"/>
@@ -2500,7 +5169,7 @@
         </w:rPr>
         <w:t xml:space="preserve">(8), 1328–1361. </w:t>
       </w:r>
-      <w:hyperlink r:id="rId9" w:history="1">
+      <w:hyperlink r:id="rId17" w:history="1">
         <w:r>
           <w:rPr>
             <w:rStyle w:val="Hyperlink"/>
@@ -2577,7 +5246,7 @@
         </w:rPr>
         <w:t xml:space="preserve">(4), 2567–2587. </w:t>
       </w:r>
-      <w:hyperlink r:id="rId10" w:history="1">
+      <w:hyperlink r:id="rId18" w:history="1">
         <w:r>
           <w:rPr>
             <w:rStyle w:val="Hyperlink"/>
@@ -2662,7 +5331,7 @@
     </w:p>
     <w:p/>
     <w:sectPr>
-      <w:headerReference w:type="default" r:id="rId11"/>
+      <w:headerReference w:type="default" r:id="rId19"/>
       <w:pgSz w:w="12240" w:h="15840"/>
       <w:pgMar w:top="1440" w:right="1440" w:bottom="1440" w:left="1440" w:header="720" w:footer="720" w:gutter="0"/>
       <w:cols w:space="720"/>

</xml_diff>